<commit_message>
doc(Planning): J'ai fait un planning du travail
</commit_message>
<xml_diff>
--- a/R-POO-pr55xpt.docx
+++ b/R-POO-pr55xpt.docx
@@ -7,13 +7,7 @@
         <w:pStyle w:val="Titre"/>
       </w:pPr>
       <w:r>
-        <w:t xml:space="preserve">Titre </w:t>
-      </w:r>
-      <w:r>
-        <w:t xml:space="preserve">(nom) </w:t>
-      </w:r>
-      <w:r>
-        <w:t>du projet</w:t>
+        <w:t>P_POO</w:t>
       </w:r>
     </w:p>
     <w:p>
@@ -82,25 +76,29 @@
     </w:p>
     <w:p>
       <w:pPr>
-        <w:jc w:val="center"/>
-      </w:pPr>
-      <w:r>
-        <w:t>(</w:t>
-      </w:r>
-      <w:r>
-        <w:t>Une</w:t>
-      </w:r>
-      <w:r>
-        <w:t xml:space="preserve"> image originale représentant le projet)</w:t>
-      </w:r>
-    </w:p>
-    <w:p>
-      <w:pPr>
         <w:spacing w:before="2000"/>
         <w:jc w:val="center"/>
-      </w:pPr>
-      <w:r>
-        <w:t>Nom de l’auteur – Classe</w:t>
+        <w:rPr>
+          <w:lang w:val="en-US"/>
+        </w:rPr>
+      </w:pPr>
+      <w:r>
+        <w:rPr>
+          <w:lang w:val="en-US"/>
+        </w:rPr>
+        <w:t>Maksym Tsybulevskyi</w:t>
+      </w:r>
+      <w:r>
+        <w:rPr>
+          <w:lang w:val="en-US"/>
+        </w:rPr>
+        <w:t xml:space="preserve"> – </w:t>
+      </w:r>
+      <w:r>
+        <w:rPr>
+          <w:lang w:val="en-US"/>
+        </w:rPr>
+        <w:t>CID2A</w:t>
       </w:r>
     </w:p>
     <w:p>
@@ -108,7 +106,7 @@
         <w:jc w:val="center"/>
       </w:pPr>
       <w:r>
-        <w:t>Lieu</w:t>
+        <w:t>Lausanne, Vennes</w:t>
       </w:r>
     </w:p>
     <w:p>
@@ -116,7 +114,7 @@
         <w:jc w:val="center"/>
       </w:pPr>
       <w:r>
-        <w:t>Durée</w:t>
+        <w:t>32 périodes</w:t>
       </w:r>
     </w:p>
     <w:p>
@@ -124,15 +122,7 @@
         <w:jc w:val="center"/>
       </w:pPr>
       <w:r>
-        <w:t>Nom du chef de projet</w:t>
-      </w:r>
-    </w:p>
-    <w:p>
-      <w:pPr>
-        <w:jc w:val="center"/>
-      </w:pPr>
-      <w:r>
-        <w:t>(Nom et adresse du mandant)</w:t>
+        <w:t>Aurélie Curchaud</w:t>
       </w:r>
     </w:p>
     <w:p>
@@ -3437,42 +3427,246 @@
     </w:p>
     <w:p>
       <w:pPr>
+        <w:pStyle w:val="Retraitcorpsdetexte"/>
+      </w:pPr>
+      <w:r>
+        <w:t>Gestion de parking</w:t>
+      </w:r>
+    </w:p>
+    <w:p>
+      <w:pPr>
+        <w:pStyle w:val="Retraitcorpsdetexte"/>
+      </w:pPr>
+    </w:p>
+    <w:p>
+      <w:pPr>
+        <w:pStyle w:val="Titre2"/>
+      </w:pPr>
+      <w:bookmarkStart w:id="6" w:name="_Toc308526318"/>
+      <w:r>
+        <w:t>Description</w:t>
+      </w:r>
+      <w:bookmarkEnd w:id="6"/>
+    </w:p>
+    <w:p>
+      <w:pPr>
+        <w:pStyle w:val="Retraitcorpsdetexte"/>
+      </w:pPr>
+    </w:p>
+    <w:p>
+      <w:pPr>
+        <w:pStyle w:val="Retraitcorpsdetexte"/>
+      </w:pPr>
+      <w:r>
+        <w:t>C</w:t>
+      </w:r>
+      <w:r>
+        <w:t>réer le simulateur du parking en console</w:t>
+      </w:r>
+    </w:p>
+    <w:p>
+      <w:pPr>
+        <w:pStyle w:val="Retraitcorpsdetexte"/>
+      </w:pPr>
+    </w:p>
+    <w:p>
+      <w:pPr>
+        <w:pStyle w:val="Titre2"/>
+      </w:pPr>
+      <w:bookmarkStart w:id="7" w:name="_Toc308526319"/>
+      <w:r>
+        <w:t>Matériel et logiciels à disposition</w:t>
+      </w:r>
+      <w:bookmarkEnd w:id="7"/>
+    </w:p>
+    <w:p>
+      <w:pPr>
+        <w:pStyle w:val="Retraitcorpsdetexte"/>
+      </w:pPr>
+    </w:p>
+    <w:p>
+      <w:pPr>
+        <w:pStyle w:val="Retraitcorpsdetexte"/>
+        <w:numPr>
+          <w:ilvl w:val="0"/>
+          <w:numId w:val="48"/>
+        </w:numPr>
+        <w:ind w:left="1134"/>
+      </w:pPr>
+      <w:r>
+        <w:t>Un PC ETML</w:t>
+      </w:r>
+    </w:p>
+    <w:p>
+      <w:pPr>
+        <w:pStyle w:val="Retraitcorpsdetexte"/>
+        <w:numPr>
+          <w:ilvl w:val="0"/>
+          <w:numId w:val="48"/>
+        </w:numPr>
+        <w:ind w:left="1134"/>
+      </w:pPr>
+      <w:r>
+        <w:t>Accès à Internet</w:t>
+      </w:r>
+    </w:p>
+    <w:p>
+      <w:pPr>
+        <w:pStyle w:val="Retraitcorpsdetexte"/>
+        <w:ind w:left="0"/>
+      </w:pPr>
+    </w:p>
+    <w:p>
+      <w:pPr>
+        <w:pStyle w:val="Titre2"/>
+      </w:pPr>
+      <w:bookmarkStart w:id="8" w:name="_Toc308526320"/>
+      <w:r>
+        <w:t>P</w:t>
+      </w:r>
+      <w:r>
+        <w:t>rérequis</w:t>
+      </w:r>
+      <w:bookmarkEnd w:id="8"/>
+    </w:p>
+    <w:p>
+      <w:pPr>
+        <w:pStyle w:val="Retraitcorpsdetexte"/>
+      </w:pPr>
+    </w:p>
+    <w:p>
+      <w:pPr>
+        <w:pStyle w:val="Retraitcorpsdetexte"/>
+        <w:numPr>
+          <w:ilvl w:val="0"/>
+          <w:numId w:val="49"/>
+        </w:numPr>
+        <w:ind w:left="1134"/>
+      </w:pPr>
+      <w:r>
+        <w:t xml:space="preserve">Modules de programmation de base </w:t>
+      </w:r>
+    </w:p>
+    <w:p>
+      <w:pPr>
+        <w:pStyle w:val="Retraitcorpsdetexte"/>
+        <w:numPr>
+          <w:ilvl w:val="0"/>
+          <w:numId w:val="49"/>
+        </w:numPr>
+        <w:ind w:left="1134"/>
+      </w:pPr>
+      <w:r>
+        <w:t>ICT-320 en cours</w:t>
+      </w:r>
+    </w:p>
+    <w:p>
+      <w:pPr>
+        <w:pStyle w:val="Retraitcorpsdetexte"/>
+      </w:pPr>
+    </w:p>
+    <w:p>
+      <w:pPr>
+        <w:pStyle w:val="Titre2"/>
+      </w:pPr>
+      <w:bookmarkStart w:id="9" w:name="_Toc308526321"/>
+      <w:r>
+        <w:t>Cahier des charges</w:t>
+      </w:r>
+      <w:bookmarkEnd w:id="9"/>
+    </w:p>
+    <w:p>
+      <w:pPr>
+        <w:pStyle w:val="Titre3"/>
+      </w:pPr>
+      <w:bookmarkStart w:id="10" w:name="_Toc308526322"/>
+      <w:r>
+        <w:t>Objectifs et portée du projet (objectifs SMART</w:t>
+      </w:r>
+      <w:r>
+        <w:t>)</w:t>
+      </w:r>
+      <w:bookmarkEnd w:id="10"/>
+    </w:p>
+    <w:p>
+      <w:pPr>
+        <w:pStyle w:val="Retraitcorpsdetexte3"/>
+      </w:pPr>
+    </w:p>
+    <w:p>
+      <w:pPr>
         <w:pStyle w:val="Informations"/>
       </w:pPr>
       <w:r>
         <w:t>A compléter</w:t>
       </w:r>
       <w:r>
-        <w:t>,</w:t>
-      </w:r>
-      <w:r>
-        <w:t xml:space="preserve">par un titre cours et pertinent. </w:t>
-      </w:r>
-      <w:r>
-        <w:t xml:space="preserve">Cela peut être une reprise ou compléter le titre de la première page </w:t>
+        <w:t>. Il s’agit d’ébaucher des réponses aux questions de l’acronyme CQQCOQP (Combien, Quoi, Qui, Comment, Où, Quand, Pourquoi)</w:t>
+      </w:r>
+    </w:p>
+    <w:p>
+      <w:pPr>
+        <w:pStyle w:val="Retraitcorpsdetexte3"/>
+      </w:pPr>
+    </w:p>
+    <w:p>
+      <w:pPr>
+        <w:pStyle w:val="Titre3"/>
+      </w:pPr>
+      <w:bookmarkStart w:id="11" w:name="_Toc308526323"/>
+      <w:r>
+        <w:t xml:space="preserve">Caractéristiques des utilisateurs et </w:t>
+      </w:r>
+      <w:r>
+        <w:t>impacts</w:t>
+      </w:r>
+      <w:bookmarkEnd w:id="11"/>
+    </w:p>
+    <w:p>
+      <w:pPr>
+        <w:pStyle w:val="Retraitcorpsdetexte3"/>
+      </w:pPr>
+    </w:p>
+    <w:p>
+      <w:pPr>
+        <w:pStyle w:val="Informations"/>
+      </w:pPr>
+      <w:r>
+        <w:t>A compléter</w:t>
       </w:r>
       <w:r>
         <w:t xml:space="preserve">… </w:t>
       </w:r>
-    </w:p>
-    <w:p>
-      <w:pPr>
-        <w:pStyle w:val="Retraitcorpsdetexte"/>
-      </w:pPr>
-    </w:p>
-    <w:p>
-      <w:pPr>
-        <w:pStyle w:val="Titre2"/>
-      </w:pPr>
-      <w:bookmarkStart w:id="6" w:name="_Toc308526318"/>
-      <w:r>
-        <w:t>Description</w:t>
-      </w:r>
-      <w:bookmarkEnd w:id="6"/>
-    </w:p>
-    <w:p>
-      <w:pPr>
-        <w:pStyle w:val="Retraitcorpsdetexte"/>
+      <w:r>
+        <w:t>Il s’agit d’identifier le(s) profil(s) de(s) utilisateur-</w:t>
+      </w:r>
+      <w:proofErr w:type="spellStart"/>
+      <w:r>
+        <w:t>trice</w:t>
+      </w:r>
+      <w:proofErr w:type="spellEnd"/>
+      <w:r>
+        <w:t>(s) type, et les conséquences que cela va avoir sur la conception (couleurs, ergonomie, utilisation, etc.)</w:t>
+      </w:r>
+    </w:p>
+    <w:p>
+      <w:pPr>
+        <w:pStyle w:val="Retraitcorpsdetexte3"/>
+      </w:pPr>
+    </w:p>
+    <w:p>
+      <w:pPr>
+        <w:pStyle w:val="Titre3"/>
+      </w:pPr>
+      <w:bookmarkStart w:id="12" w:name="_Toc308526324"/>
+      <w:r>
+        <w:t>Fonctionnalités requises (du point de vue de l’utilisateur)</w:t>
+      </w:r>
+      <w:bookmarkEnd w:id="12"/>
+    </w:p>
+    <w:p>
+      <w:pPr>
+        <w:pStyle w:val="Retraitcorpsdetexte3"/>
       </w:pPr>
     </w:p>
     <w:p>
@@ -3480,16 +3674,10 @@
         <w:pStyle w:val="Informations"/>
       </w:pPr>
       <w:r>
-        <w:t>A compléter</w:t>
-      </w:r>
-      <w:r>
-        <w:t>,</w:t>
-      </w:r>
-      <w:r>
-        <w:t>par une explication du contexte, de la situation, des raisons</w:t>
-      </w:r>
-      <w:r>
-        <w:t xml:space="preserve"> générales de la mise en route d’un tel projet. Le lecteur doit pouvoir comprendre les motivations du lancement du projet</w:t>
+        <w:t xml:space="preserve">A compléter </w:t>
+      </w:r>
+      <w:r>
+        <w:t xml:space="preserve">par une espèce de mode d’emploi du produit. S’il s’agissait d’une montre, décrire qu’à part l’heure, il y aura la possibilité d’utiliser un chronomètre, un réveil, </w:t>
       </w:r>
       <w:r>
         <w:t xml:space="preserve">… </w:t>
@@ -3497,22 +3685,22 @@
     </w:p>
     <w:p>
       <w:pPr>
-        <w:pStyle w:val="Retraitcorpsdetexte"/>
-      </w:pPr>
-    </w:p>
-    <w:p>
-      <w:pPr>
-        <w:pStyle w:val="Titre2"/>
-      </w:pPr>
-      <w:bookmarkStart w:id="7" w:name="_Toc308526319"/>
-      <w:r>
-        <w:t>Matériel et logiciels à disposition</w:t>
-      </w:r>
-      <w:bookmarkEnd w:id="7"/>
-    </w:p>
-    <w:p>
-      <w:pPr>
-        <w:pStyle w:val="Retraitcorpsdetexte"/>
+        <w:pStyle w:val="Retraitcorpsdetexte3"/>
+      </w:pPr>
+    </w:p>
+    <w:p>
+      <w:pPr>
+        <w:pStyle w:val="Titre3"/>
+      </w:pPr>
+      <w:bookmarkStart w:id="13" w:name="_Toc308526325"/>
+      <w:r>
+        <w:t>Contraintes</w:t>
+      </w:r>
+      <w:bookmarkEnd w:id="13"/>
+    </w:p>
+    <w:p>
+      <w:pPr>
+        <w:pStyle w:val="Retraitcorpsdetexte3"/>
       </w:pPr>
     </w:p>
     <w:p>
@@ -3520,10 +3708,51 @@
         <w:pStyle w:val="Informations"/>
       </w:pPr>
       <w:r>
-        <w:t>A compléter</w:t>
-      </w:r>
-      <w:r>
-        <w:t xml:space="preserve"> par ce qui est nécessaire pour le démarrage</w:t>
+        <w:t>S</w:t>
+      </w:r>
+      <w:r>
+        <w:t>écurité,</w:t>
+      </w:r>
+      <w:r>
+        <w:t xml:space="preserve"> backups, disponibilité,</w:t>
+      </w:r>
+      <w:r>
+        <w:t xml:space="preserve"> système utilisé, interfa</w:t>
+      </w:r>
+      <w:r>
+        <w:t>ces avec autres logiciels, etc.</w:t>
+      </w:r>
+    </w:p>
+    <w:p>
+      <w:pPr>
+        <w:pStyle w:val="Retraitcorpsdetexte3"/>
+      </w:pPr>
+    </w:p>
+    <w:p>
+      <w:pPr>
+        <w:pStyle w:val="Titre3"/>
+      </w:pPr>
+      <w:bookmarkStart w:id="14" w:name="_Toc308526326"/>
+      <w:r>
+        <w:t>Travail à réaliser par l'apprenti</w:t>
+      </w:r>
+      <w:bookmarkEnd w:id="14"/>
+    </w:p>
+    <w:p>
+      <w:pPr>
+        <w:pStyle w:val="Retraitcorpsdetexte3"/>
+      </w:pPr>
+    </w:p>
+    <w:p>
+      <w:pPr>
+        <w:pStyle w:val="Informations"/>
+      </w:pPr>
+      <w:r>
+        <w:lastRenderedPageBreak/>
+        <w:t xml:space="preserve">Décrire à quoi doit ressembler le travail produit, ce qu’il faudra </w:t>
+      </w:r>
+      <w:r>
+        <w:t>rendre</w:t>
       </w:r>
       <w:r>
         <w:t xml:space="preserve"> … </w:t>
@@ -3531,25 +3760,22 @@
     </w:p>
     <w:p>
       <w:pPr>
-        <w:pStyle w:val="Retraitcorpsdetexte"/>
-      </w:pPr>
-    </w:p>
-    <w:p>
-      <w:pPr>
-        <w:pStyle w:val="Titre2"/>
-      </w:pPr>
-      <w:bookmarkStart w:id="8" w:name="_Toc308526320"/>
-      <w:r>
-        <w:t>P</w:t>
-      </w:r>
-      <w:r>
-        <w:t>rérequis</w:t>
-      </w:r>
-      <w:bookmarkEnd w:id="8"/>
-    </w:p>
-    <w:p>
-      <w:pPr>
-        <w:pStyle w:val="Retraitcorpsdetexte"/>
+        <w:pStyle w:val="Retraitcorpsdetexte3"/>
+      </w:pPr>
+    </w:p>
+    <w:p>
+      <w:pPr>
+        <w:pStyle w:val="Titre3"/>
+      </w:pPr>
+      <w:bookmarkStart w:id="15" w:name="_Toc308526327"/>
+      <w:r>
+        <w:t>Si le temps le permet …</w:t>
+      </w:r>
+      <w:bookmarkEnd w:id="15"/>
+    </w:p>
+    <w:p>
+      <w:pPr>
+        <w:pStyle w:val="Retraitcorpsdetexte3"/>
       </w:pPr>
     </w:p>
     <w:p>
@@ -3557,233 +3783,18 @@
         <w:pStyle w:val="Informations"/>
       </w:pPr>
       <w:r>
-        <w:t>A compléter</w:t>
-      </w:r>
-      <w:r>
-        <w:t xml:space="preserve"> par une description des compétences, des connaissances et de la formation minimum pour être à même de réaliser le projet</w:t>
-      </w:r>
-      <w:r>
-        <w:t xml:space="preserve"> … </w:t>
-      </w:r>
-    </w:p>
-    <w:p>
-      <w:pPr>
-        <w:pStyle w:val="Retraitcorpsdetexte"/>
-      </w:pPr>
-    </w:p>
-    <w:p>
-      <w:pPr>
-        <w:pStyle w:val="Titre2"/>
-      </w:pPr>
-      <w:bookmarkStart w:id="9" w:name="_Toc308526321"/>
-      <w:r>
-        <w:t>Cahier des charges</w:t>
-      </w:r>
-      <w:bookmarkEnd w:id="9"/>
-    </w:p>
-    <w:p>
-      <w:pPr>
-        <w:pStyle w:val="Titre3"/>
-      </w:pPr>
-      <w:bookmarkStart w:id="10" w:name="_Toc308526322"/>
-      <w:r>
-        <w:t>Objectifs et portée du projet (objectifs SMART</w:t>
-      </w:r>
-      <w:r>
-        <w:t>)</w:t>
-      </w:r>
-      <w:bookmarkEnd w:id="10"/>
-    </w:p>
-    <w:p>
-      <w:pPr>
-        <w:pStyle w:val="Retraitcorpsdetexte3"/>
-      </w:pPr>
-    </w:p>
-    <w:p>
-      <w:pPr>
-        <w:pStyle w:val="Informations"/>
-      </w:pPr>
-      <w:r>
-        <w:t>A compléter</w:t>
-      </w:r>
-      <w:r>
-        <w:t>. Il s’agit d’ébaucher des réponses aux questions de l’acronyme CQQCOQP (Combien, Quoi, Qui, Comment, Où, Quand, Pourquoi)</w:t>
-      </w:r>
-    </w:p>
-    <w:p>
-      <w:pPr>
-        <w:pStyle w:val="Retraitcorpsdetexte3"/>
-      </w:pPr>
-    </w:p>
-    <w:p>
-      <w:pPr>
-        <w:pStyle w:val="Titre3"/>
-      </w:pPr>
-      <w:bookmarkStart w:id="11" w:name="_Toc308526323"/>
-      <w:r>
-        <w:t xml:space="preserve">Caractéristiques des utilisateurs et </w:t>
-      </w:r>
-      <w:r>
-        <w:t>impacts</w:t>
-      </w:r>
-      <w:bookmarkEnd w:id="11"/>
-    </w:p>
-    <w:p>
-      <w:pPr>
-        <w:pStyle w:val="Retraitcorpsdetexte3"/>
-      </w:pPr>
-    </w:p>
-    <w:p>
-      <w:pPr>
-        <w:pStyle w:val="Informations"/>
-      </w:pPr>
-      <w:r>
-        <w:t>A compléter</w:t>
-      </w:r>
-      <w:r>
-        <w:t xml:space="preserve">… </w:t>
-      </w:r>
-      <w:r>
-        <w:t>Il s’agit d’identifier le(s) profil(s) de(s) utilisateur-trice(s) type, et les conséquences que cela va avoir sur la conception (couleurs, ergonomie, utilisation, etc.)</w:t>
-      </w:r>
-    </w:p>
-    <w:p>
-      <w:pPr>
-        <w:pStyle w:val="Retraitcorpsdetexte3"/>
-      </w:pPr>
-    </w:p>
-    <w:p>
-      <w:pPr>
-        <w:pStyle w:val="Titre3"/>
-      </w:pPr>
-      <w:bookmarkStart w:id="12" w:name="_Toc308526324"/>
-      <w:r>
-        <w:t>Fonctionnalités requises (du point de vue de l’utilisateur)</w:t>
-      </w:r>
-      <w:bookmarkEnd w:id="12"/>
-    </w:p>
-    <w:p>
-      <w:pPr>
-        <w:pStyle w:val="Retraitcorpsdetexte3"/>
-      </w:pPr>
-    </w:p>
-    <w:p>
-      <w:pPr>
-        <w:pStyle w:val="Informations"/>
-      </w:pPr>
-      <w:r>
-        <w:t xml:space="preserve">A compléter </w:t>
-      </w:r>
-      <w:r>
-        <w:t xml:space="preserve">par une espèce de mode d’emploi du produit. S’il s’agissait d’une montre, décrire qu’à part l’heure, il y aura la possibilité d’utiliser un chronomètre, un réveil, </w:t>
-      </w:r>
-      <w:r>
-        <w:t xml:space="preserve">… </w:t>
-      </w:r>
-    </w:p>
-    <w:p>
-      <w:pPr>
-        <w:pStyle w:val="Retraitcorpsdetexte3"/>
-      </w:pPr>
-    </w:p>
-    <w:p>
-      <w:pPr>
-        <w:pStyle w:val="Titre3"/>
-      </w:pPr>
-      <w:bookmarkStart w:id="13" w:name="_Toc308526325"/>
-      <w:r>
-        <w:t>Contraintes</w:t>
-      </w:r>
-      <w:bookmarkEnd w:id="13"/>
-    </w:p>
-    <w:p>
-      <w:pPr>
-        <w:pStyle w:val="Retraitcorpsdetexte3"/>
-      </w:pPr>
-    </w:p>
-    <w:p>
-      <w:pPr>
-        <w:pStyle w:val="Informations"/>
-      </w:pPr>
-      <w:r>
-        <w:t>S</w:t>
-      </w:r>
-      <w:r>
-        <w:t>écurité,</w:t>
-      </w:r>
-      <w:r>
-        <w:t xml:space="preserve"> backups, disponibilité,</w:t>
-      </w:r>
-      <w:r>
-        <w:t xml:space="preserve"> système utilisé, interfa</w:t>
-      </w:r>
-      <w:r>
-        <w:t>ces avec autres logiciels, etc.</w:t>
-      </w:r>
-    </w:p>
-    <w:p>
-      <w:pPr>
-        <w:pStyle w:val="Retraitcorpsdetexte3"/>
-      </w:pPr>
-    </w:p>
-    <w:p>
-      <w:pPr>
-        <w:pStyle w:val="Titre3"/>
-      </w:pPr>
-      <w:bookmarkStart w:id="14" w:name="_Toc308526326"/>
-      <w:r>
-        <w:t>Travail à réaliser par l'apprenti</w:t>
-      </w:r>
-      <w:bookmarkEnd w:id="14"/>
-    </w:p>
-    <w:p>
-      <w:pPr>
-        <w:pStyle w:val="Retraitcorpsdetexte3"/>
-      </w:pPr>
-    </w:p>
-    <w:p>
-      <w:pPr>
-        <w:pStyle w:val="Informations"/>
-      </w:pPr>
-      <w:r>
-        <w:t xml:space="preserve">Décrire à quoi doit ressembler le travail produit, ce qu’il faudra </w:t>
-      </w:r>
-      <w:r>
-        <w:t>rendre</w:t>
-      </w:r>
-      <w:r>
-        <w:t xml:space="preserve"> … </w:t>
-      </w:r>
-    </w:p>
-    <w:p>
-      <w:pPr>
-        <w:pStyle w:val="Retraitcorpsdetexte3"/>
-      </w:pPr>
-    </w:p>
-    <w:p>
-      <w:pPr>
-        <w:pStyle w:val="Titre3"/>
-      </w:pPr>
-      <w:bookmarkStart w:id="15" w:name="_Toc308526327"/>
-      <w:r>
-        <w:t>Si le temps le permet …</w:t>
-      </w:r>
-      <w:bookmarkEnd w:id="15"/>
-    </w:p>
-    <w:p>
-      <w:pPr>
-        <w:pStyle w:val="Retraitcorpsdetexte3"/>
-      </w:pPr>
-    </w:p>
-    <w:p>
-      <w:pPr>
-        <w:pStyle w:val="Informations"/>
-      </w:pPr>
-      <w:r>
-        <w:t>Objectifs complémentaires</w:t>
-      </w:r>
-      <w:r>
-        <w:t>au cas où le projet n’est pas assez ambitieux dans le temps imparti</w:t>
+        <w:t xml:space="preserve">Objectifs </w:t>
+      </w:r>
+      <w:proofErr w:type="spellStart"/>
+      <w:r>
+        <w:t>complémentaires</w:t>
+      </w:r>
+      <w:r>
+        <w:t>au</w:t>
+      </w:r>
+      <w:proofErr w:type="spellEnd"/>
+      <w:r>
+        <w:t xml:space="preserve"> cas où le projet n’est pas assez ambitieux dans le temps imparti</w:t>
       </w:r>
       <w:r>
         <w:t xml:space="preserve">… </w:t>
@@ -4291,8 +4302,15 @@
         </w:numPr>
       </w:pPr>
       <w:r>
-        <w:lastRenderedPageBreak/>
-        <w:t xml:space="preserve">Schémas de navigation, schémas événementiels, structogramme, </w:t>
+        <w:t xml:space="preserve">Schémas de navigation, schémas événementiels, </w:t>
+      </w:r>
+      <w:proofErr w:type="spellStart"/>
+      <w:r>
+        <w:t>structogramme</w:t>
+      </w:r>
+      <w:proofErr w:type="spellEnd"/>
+      <w:r>
+        <w:t xml:space="preserve">, </w:t>
       </w:r>
       <w:r>
         <w:t>pseudocode</w:t>
@@ -4354,6 +4372,7 @@
       <w:bookmarkStart w:id="28" w:name="_Toc165969651"/>
       <w:bookmarkStart w:id="29" w:name="_Toc308526335"/>
       <w:r>
+        <w:lastRenderedPageBreak/>
         <w:t>Conception des tests</w:t>
       </w:r>
       <w:bookmarkEnd w:id="27"/>
@@ -4891,15 +4910,7 @@
         <w:t xml:space="preserve"> projet.</w:t>
       </w:r>
       <w:r>
-        <w:t xml:space="preserve"> Indiquer </w:t>
-      </w:r>
-      <w:proofErr w:type="gramStart"/>
-      <w:r>
-        <w:t>les différence</w:t>
-      </w:r>
-      <w:proofErr w:type="gramEnd"/>
-      <w:r>
-        <w:t xml:space="preserve"> entre les planifications initiales et détaillées avec le journal de travail.</w:t>
+        <w:t xml:space="preserve"> Indiquer les différence entre les planifications initiales et détaillées avec le journal de travail.</w:t>
       </w:r>
     </w:p>
     <w:p>
@@ -4995,7 +5006,6 @@
         </w:numPr>
       </w:pPr>
       <w:r>
-        <w:lastRenderedPageBreak/>
         <w:t>Suite à donner, améliorations souhaitables, …</w:t>
       </w:r>
     </w:p>
@@ -5019,6 +5029,7 @@
       <w:bookmarkStart w:id="57" w:name="_Toc165969657"/>
       <w:bookmarkStart w:id="58" w:name="_Toc308526346"/>
       <w:r>
+        <w:lastRenderedPageBreak/>
         <w:t>Divers</w:t>
       </w:r>
       <w:bookmarkEnd w:id="56"/>
@@ -5279,14 +5290,7 @@
               <w:rFonts w:cs="Arial"/>
               <w:szCs w:val="16"/>
             </w:rPr>
-            <w:t> </w:t>
-          </w:r>
-          <w:r>
-            <w:rPr>
-              <w:rFonts w:cs="Arial"/>
-              <w:szCs w:val="16"/>
-            </w:rPr>
-            <w:t>:</w:t>
+            <w:t> :</w:t>
           </w:r>
           <w:fldSimple w:instr=" AUTHOR   \* MERGEFORMAT ">
             <w:r>
@@ -5680,7 +5684,7 @@
               <w:noProof/>
               <w:szCs w:val="16"/>
             </w:rPr>
-            <w:t>00.00.0000 00:00</w:t>
+            <w:t>28.08.2026 09:00</w:t>
           </w:r>
           <w:r>
             <w:rPr>
@@ -7778,6 +7782,119 @@
     </w:lvl>
   </w:abstractNum>
   <w:abstractNum w:abstractNumId="25" w15:restartNumberingAfterBreak="0">
+    <w:nsid w:val="3E6724EF"/>
+    <w:multiLevelType w:val="hybridMultilevel"/>
+    <w:tmpl w:val="60A87854"/>
+    <w:lvl w:ilvl="0" w:tplc="100C0001">
+      <w:start w:val="1"/>
+      <w:numFmt w:val="bullet"/>
+      <w:lvlText w:val=""/>
+      <w:lvlJc w:val="left"/>
+      <w:pPr>
+        <w:ind w:left="1854" w:hanging="360"/>
+      </w:pPr>
+      <w:rPr>
+        <w:rFonts w:ascii="Symbol" w:hAnsi="Symbol" w:hint="default"/>
+      </w:rPr>
+    </w:lvl>
+    <w:lvl w:ilvl="1" w:tplc="100C0003" w:tentative="1">
+      <w:start w:val="1"/>
+      <w:numFmt w:val="bullet"/>
+      <w:lvlText w:val="o"/>
+      <w:lvlJc w:val="left"/>
+      <w:pPr>
+        <w:ind w:left="2574" w:hanging="360"/>
+      </w:pPr>
+      <w:rPr>
+        <w:rFonts w:ascii="Courier New" w:hAnsi="Courier New" w:cs="Courier New" w:hint="default"/>
+      </w:rPr>
+    </w:lvl>
+    <w:lvl w:ilvl="2" w:tplc="100C0005" w:tentative="1">
+      <w:start w:val="1"/>
+      <w:numFmt w:val="bullet"/>
+      <w:lvlText w:val=""/>
+      <w:lvlJc w:val="left"/>
+      <w:pPr>
+        <w:ind w:left="3294" w:hanging="360"/>
+      </w:pPr>
+      <w:rPr>
+        <w:rFonts w:ascii="Wingdings" w:hAnsi="Wingdings" w:hint="default"/>
+      </w:rPr>
+    </w:lvl>
+    <w:lvl w:ilvl="3" w:tplc="100C0001" w:tentative="1">
+      <w:start w:val="1"/>
+      <w:numFmt w:val="bullet"/>
+      <w:lvlText w:val=""/>
+      <w:lvlJc w:val="left"/>
+      <w:pPr>
+        <w:ind w:left="4014" w:hanging="360"/>
+      </w:pPr>
+      <w:rPr>
+        <w:rFonts w:ascii="Symbol" w:hAnsi="Symbol" w:hint="default"/>
+      </w:rPr>
+    </w:lvl>
+    <w:lvl w:ilvl="4" w:tplc="100C0003" w:tentative="1">
+      <w:start w:val="1"/>
+      <w:numFmt w:val="bullet"/>
+      <w:lvlText w:val="o"/>
+      <w:lvlJc w:val="left"/>
+      <w:pPr>
+        <w:ind w:left="4734" w:hanging="360"/>
+      </w:pPr>
+      <w:rPr>
+        <w:rFonts w:ascii="Courier New" w:hAnsi="Courier New" w:cs="Courier New" w:hint="default"/>
+      </w:rPr>
+    </w:lvl>
+    <w:lvl w:ilvl="5" w:tplc="100C0005" w:tentative="1">
+      <w:start w:val="1"/>
+      <w:numFmt w:val="bullet"/>
+      <w:lvlText w:val=""/>
+      <w:lvlJc w:val="left"/>
+      <w:pPr>
+        <w:ind w:left="5454" w:hanging="360"/>
+      </w:pPr>
+      <w:rPr>
+        <w:rFonts w:ascii="Wingdings" w:hAnsi="Wingdings" w:hint="default"/>
+      </w:rPr>
+    </w:lvl>
+    <w:lvl w:ilvl="6" w:tplc="100C0001" w:tentative="1">
+      <w:start w:val="1"/>
+      <w:numFmt w:val="bullet"/>
+      <w:lvlText w:val=""/>
+      <w:lvlJc w:val="left"/>
+      <w:pPr>
+        <w:ind w:left="6174" w:hanging="360"/>
+      </w:pPr>
+      <w:rPr>
+        <w:rFonts w:ascii="Symbol" w:hAnsi="Symbol" w:hint="default"/>
+      </w:rPr>
+    </w:lvl>
+    <w:lvl w:ilvl="7" w:tplc="100C0003" w:tentative="1">
+      <w:start w:val="1"/>
+      <w:numFmt w:val="bullet"/>
+      <w:lvlText w:val="o"/>
+      <w:lvlJc w:val="left"/>
+      <w:pPr>
+        <w:ind w:left="6894" w:hanging="360"/>
+      </w:pPr>
+      <w:rPr>
+        <w:rFonts w:ascii="Courier New" w:hAnsi="Courier New" w:cs="Courier New" w:hint="default"/>
+      </w:rPr>
+    </w:lvl>
+    <w:lvl w:ilvl="8" w:tplc="100C0005" w:tentative="1">
+      <w:start w:val="1"/>
+      <w:numFmt w:val="bullet"/>
+      <w:lvlText w:val=""/>
+      <w:lvlJc w:val="left"/>
+      <w:pPr>
+        <w:ind w:left="7614" w:hanging="360"/>
+      </w:pPr>
+      <w:rPr>
+        <w:rFonts w:ascii="Wingdings" w:hAnsi="Wingdings" w:hint="default"/>
+      </w:rPr>
+    </w:lvl>
+  </w:abstractNum>
+  <w:abstractNum w:abstractNumId="26" w15:restartNumberingAfterBreak="0">
     <w:nsid w:val="3EF922F0"/>
     <w:multiLevelType w:val="multilevel"/>
     <w:tmpl w:val="100C0021"/>
@@ -7890,7 +8007,120 @@
       </w:rPr>
     </w:lvl>
   </w:abstractNum>
-  <w:abstractNum w:abstractNumId="26" w15:restartNumberingAfterBreak="0">
+  <w:abstractNum w:abstractNumId="27" w15:restartNumberingAfterBreak="0">
+    <w:nsid w:val="477A47D8"/>
+    <w:multiLevelType w:val="hybridMultilevel"/>
+    <w:tmpl w:val="C5249922"/>
+    <w:lvl w:ilvl="0" w:tplc="100C0001">
+      <w:start w:val="1"/>
+      <w:numFmt w:val="bullet"/>
+      <w:lvlText w:val=""/>
+      <w:lvlJc w:val="left"/>
+      <w:pPr>
+        <w:ind w:left="1854" w:hanging="360"/>
+      </w:pPr>
+      <w:rPr>
+        <w:rFonts w:ascii="Symbol" w:hAnsi="Symbol" w:hint="default"/>
+      </w:rPr>
+    </w:lvl>
+    <w:lvl w:ilvl="1" w:tplc="100C0003" w:tentative="1">
+      <w:start w:val="1"/>
+      <w:numFmt w:val="bullet"/>
+      <w:lvlText w:val="o"/>
+      <w:lvlJc w:val="left"/>
+      <w:pPr>
+        <w:ind w:left="2574" w:hanging="360"/>
+      </w:pPr>
+      <w:rPr>
+        <w:rFonts w:ascii="Courier New" w:hAnsi="Courier New" w:cs="Courier New" w:hint="default"/>
+      </w:rPr>
+    </w:lvl>
+    <w:lvl w:ilvl="2" w:tplc="100C0005" w:tentative="1">
+      <w:start w:val="1"/>
+      <w:numFmt w:val="bullet"/>
+      <w:lvlText w:val=""/>
+      <w:lvlJc w:val="left"/>
+      <w:pPr>
+        <w:ind w:left="3294" w:hanging="360"/>
+      </w:pPr>
+      <w:rPr>
+        <w:rFonts w:ascii="Wingdings" w:hAnsi="Wingdings" w:hint="default"/>
+      </w:rPr>
+    </w:lvl>
+    <w:lvl w:ilvl="3" w:tplc="100C0001" w:tentative="1">
+      <w:start w:val="1"/>
+      <w:numFmt w:val="bullet"/>
+      <w:lvlText w:val=""/>
+      <w:lvlJc w:val="left"/>
+      <w:pPr>
+        <w:ind w:left="4014" w:hanging="360"/>
+      </w:pPr>
+      <w:rPr>
+        <w:rFonts w:ascii="Symbol" w:hAnsi="Symbol" w:hint="default"/>
+      </w:rPr>
+    </w:lvl>
+    <w:lvl w:ilvl="4" w:tplc="100C0003" w:tentative="1">
+      <w:start w:val="1"/>
+      <w:numFmt w:val="bullet"/>
+      <w:lvlText w:val="o"/>
+      <w:lvlJc w:val="left"/>
+      <w:pPr>
+        <w:ind w:left="4734" w:hanging="360"/>
+      </w:pPr>
+      <w:rPr>
+        <w:rFonts w:ascii="Courier New" w:hAnsi="Courier New" w:cs="Courier New" w:hint="default"/>
+      </w:rPr>
+    </w:lvl>
+    <w:lvl w:ilvl="5" w:tplc="100C0005" w:tentative="1">
+      <w:start w:val="1"/>
+      <w:numFmt w:val="bullet"/>
+      <w:lvlText w:val=""/>
+      <w:lvlJc w:val="left"/>
+      <w:pPr>
+        <w:ind w:left="5454" w:hanging="360"/>
+      </w:pPr>
+      <w:rPr>
+        <w:rFonts w:ascii="Wingdings" w:hAnsi="Wingdings" w:hint="default"/>
+      </w:rPr>
+    </w:lvl>
+    <w:lvl w:ilvl="6" w:tplc="100C0001" w:tentative="1">
+      <w:start w:val="1"/>
+      <w:numFmt w:val="bullet"/>
+      <w:lvlText w:val=""/>
+      <w:lvlJc w:val="left"/>
+      <w:pPr>
+        <w:ind w:left="6174" w:hanging="360"/>
+      </w:pPr>
+      <w:rPr>
+        <w:rFonts w:ascii="Symbol" w:hAnsi="Symbol" w:hint="default"/>
+      </w:rPr>
+    </w:lvl>
+    <w:lvl w:ilvl="7" w:tplc="100C0003" w:tentative="1">
+      <w:start w:val="1"/>
+      <w:numFmt w:val="bullet"/>
+      <w:lvlText w:val="o"/>
+      <w:lvlJc w:val="left"/>
+      <w:pPr>
+        <w:ind w:left="6894" w:hanging="360"/>
+      </w:pPr>
+      <w:rPr>
+        <w:rFonts w:ascii="Courier New" w:hAnsi="Courier New" w:cs="Courier New" w:hint="default"/>
+      </w:rPr>
+    </w:lvl>
+    <w:lvl w:ilvl="8" w:tplc="100C0005" w:tentative="1">
+      <w:start w:val="1"/>
+      <w:numFmt w:val="bullet"/>
+      <w:lvlText w:val=""/>
+      <w:lvlJc w:val="left"/>
+      <w:pPr>
+        <w:ind w:left="7614" w:hanging="360"/>
+      </w:pPr>
+      <w:rPr>
+        <w:rFonts w:ascii="Wingdings" w:hAnsi="Wingdings" w:hint="default"/>
+      </w:rPr>
+    </w:lvl>
+  </w:abstractNum>
+  <w:abstractNum w:abstractNumId="28" w15:restartNumberingAfterBreak="0">
     <w:nsid w:val="486164F4"/>
     <w:multiLevelType w:val="multilevel"/>
     <w:tmpl w:val="100C0021"/>
@@ -8003,7 +8233,7 @@
       </w:rPr>
     </w:lvl>
   </w:abstractNum>
-  <w:abstractNum w:abstractNumId="27" w15:restartNumberingAfterBreak="0">
+  <w:abstractNum w:abstractNumId="29" w15:restartNumberingAfterBreak="0">
     <w:nsid w:val="4C4E14AC"/>
     <w:multiLevelType w:val="multilevel"/>
     <w:tmpl w:val="100C001F"/>
@@ -8089,7 +8319,7 @@
       </w:pPr>
     </w:lvl>
   </w:abstractNum>
-  <w:abstractNum w:abstractNumId="28" w15:restartNumberingAfterBreak="0">
+  <w:abstractNum w:abstractNumId="30" w15:restartNumberingAfterBreak="0">
     <w:nsid w:val="4D30734E"/>
     <w:multiLevelType w:val="multilevel"/>
     <w:tmpl w:val="100C001D"/>
@@ -8175,7 +8405,7 @@
       </w:pPr>
     </w:lvl>
   </w:abstractNum>
-  <w:abstractNum w:abstractNumId="29" w15:restartNumberingAfterBreak="0">
+  <w:abstractNum w:abstractNumId="31" w15:restartNumberingAfterBreak="0">
     <w:nsid w:val="55FE2729"/>
     <w:multiLevelType w:val="multilevel"/>
     <w:tmpl w:val="100C0023"/>
@@ -8262,7 +8492,7 @@
       </w:pPr>
     </w:lvl>
   </w:abstractNum>
-  <w:abstractNum w:abstractNumId="30" w15:restartNumberingAfterBreak="0">
+  <w:abstractNum w:abstractNumId="32" w15:restartNumberingAfterBreak="0">
     <w:nsid w:val="58933B2A"/>
     <w:multiLevelType w:val="multilevel"/>
     <w:tmpl w:val="100C0021"/>
@@ -8375,7 +8605,7 @@
       </w:rPr>
     </w:lvl>
   </w:abstractNum>
-  <w:abstractNum w:abstractNumId="31" w15:restartNumberingAfterBreak="0">
+  <w:abstractNum w:abstractNumId="33" w15:restartNumberingAfterBreak="0">
     <w:nsid w:val="5C877673"/>
     <w:multiLevelType w:val="multilevel"/>
     <w:tmpl w:val="100C0021"/>
@@ -8488,7 +8718,7 @@
       </w:rPr>
     </w:lvl>
   </w:abstractNum>
-  <w:abstractNum w:abstractNumId="32" w15:restartNumberingAfterBreak="0">
+  <w:abstractNum w:abstractNumId="34" w15:restartNumberingAfterBreak="0">
     <w:nsid w:val="5CBC53EC"/>
     <w:multiLevelType w:val="multilevel"/>
     <w:tmpl w:val="2F6EF210"/>
@@ -8601,7 +8831,7 @@
       </w:rPr>
     </w:lvl>
   </w:abstractNum>
-  <w:abstractNum w:abstractNumId="33" w15:restartNumberingAfterBreak="0">
+  <w:abstractNum w:abstractNumId="35" w15:restartNumberingAfterBreak="0">
     <w:nsid w:val="5E424682"/>
     <w:multiLevelType w:val="multilevel"/>
     <w:tmpl w:val="100C001F"/>
@@ -8687,7 +8917,7 @@
       </w:pPr>
     </w:lvl>
   </w:abstractNum>
-  <w:abstractNum w:abstractNumId="34" w15:restartNumberingAfterBreak="0">
+  <w:abstractNum w:abstractNumId="36" w15:restartNumberingAfterBreak="0">
     <w:nsid w:val="63A9062F"/>
     <w:multiLevelType w:val="multilevel"/>
     <w:tmpl w:val="DCCE794A"/>
@@ -8827,7 +9057,7 @@
       </w:rPr>
     </w:lvl>
   </w:abstractNum>
-  <w:abstractNum w:abstractNumId="35" w15:restartNumberingAfterBreak="0">
+  <w:abstractNum w:abstractNumId="37" w15:restartNumberingAfterBreak="0">
     <w:nsid w:val="643F0961"/>
     <w:multiLevelType w:val="multilevel"/>
     <w:tmpl w:val="100C0021"/>
@@ -8940,7 +9170,7 @@
       </w:rPr>
     </w:lvl>
   </w:abstractNum>
-  <w:abstractNum w:abstractNumId="36" w15:restartNumberingAfterBreak="0">
+  <w:abstractNum w:abstractNumId="38" w15:restartNumberingAfterBreak="0">
     <w:nsid w:val="6D6476B9"/>
     <w:multiLevelType w:val="multilevel"/>
     <w:tmpl w:val="100C0023"/>
@@ -9027,7 +9257,7 @@
       </w:pPr>
     </w:lvl>
   </w:abstractNum>
-  <w:abstractNum w:abstractNumId="37" w15:restartNumberingAfterBreak="0">
+  <w:abstractNum w:abstractNumId="39" w15:restartNumberingAfterBreak="0">
     <w:nsid w:val="70C03573"/>
     <w:multiLevelType w:val="multilevel"/>
     <w:tmpl w:val="100C0021"/>
@@ -9140,7 +9370,7 @@
       </w:rPr>
     </w:lvl>
   </w:abstractNum>
-  <w:abstractNum w:abstractNumId="38" w15:restartNumberingAfterBreak="0">
+  <w:abstractNum w:abstractNumId="40" w15:restartNumberingAfterBreak="0">
     <w:nsid w:val="79CD09A9"/>
     <w:multiLevelType w:val="multilevel"/>
     <w:tmpl w:val="100C0021"/>
@@ -9253,7 +9483,7 @@
       </w:rPr>
     </w:lvl>
   </w:abstractNum>
-  <w:abstractNum w:abstractNumId="39" w15:restartNumberingAfterBreak="0">
+  <w:abstractNum w:abstractNumId="41" w15:restartNumberingAfterBreak="0">
     <w:nsid w:val="7E7F1C51"/>
     <w:multiLevelType w:val="multilevel"/>
     <w:tmpl w:val="100C0021"/>
@@ -9376,10 +9606,10 @@
     <w:abstractNumId w:val="15"/>
   </w:num>
   <w:num w:numId="4" w16cid:durableId="1199928432">
-    <w:abstractNumId w:val="34"/>
+    <w:abstractNumId w:val="36"/>
   </w:num>
   <w:num w:numId="5" w16cid:durableId="392124212">
-    <w:abstractNumId w:val="34"/>
+    <w:abstractNumId w:val="36"/>
   </w:num>
   <w:num w:numId="6" w16cid:durableId="157427276">
     <w:abstractNumId w:val="15"/>
@@ -9394,7 +9624,7 @@
     <w:abstractNumId w:val="15"/>
   </w:num>
   <w:num w:numId="10" w16cid:durableId="516969207">
-    <w:abstractNumId w:val="34"/>
+    <w:abstractNumId w:val="36"/>
   </w:num>
   <w:num w:numId="11" w16cid:durableId="904872612">
     <w:abstractNumId w:val="15"/>
@@ -9412,25 +9642,25 @@
     <w:abstractNumId w:val="16"/>
   </w:num>
   <w:num w:numId="16" w16cid:durableId="1056196879">
-    <w:abstractNumId w:val="31"/>
+    <w:abstractNumId w:val="33"/>
   </w:num>
   <w:num w:numId="17" w16cid:durableId="1900942368">
-    <w:abstractNumId w:val="26"/>
+    <w:abstractNumId w:val="28"/>
   </w:num>
   <w:num w:numId="18" w16cid:durableId="166412273">
-    <w:abstractNumId w:val="39"/>
+    <w:abstractNumId w:val="41"/>
   </w:num>
   <w:num w:numId="19" w16cid:durableId="629407992">
-    <w:abstractNumId w:val="37"/>
+    <w:abstractNumId w:val="39"/>
   </w:num>
   <w:num w:numId="20" w16cid:durableId="1300527471">
     <w:abstractNumId w:val="10"/>
   </w:num>
   <w:num w:numId="21" w16cid:durableId="914360795">
-    <w:abstractNumId w:val="35"/>
+    <w:abstractNumId w:val="37"/>
   </w:num>
   <w:num w:numId="22" w16cid:durableId="554900527">
-    <w:abstractNumId w:val="25"/>
+    <w:abstractNumId w:val="26"/>
   </w:num>
   <w:num w:numId="23" w16cid:durableId="1415275624">
     <w:abstractNumId w:val="23"/>
@@ -9445,19 +9675,19 @@
     <w:abstractNumId w:val="12"/>
   </w:num>
   <w:num w:numId="27" w16cid:durableId="1031147427">
+    <w:abstractNumId w:val="32"/>
+  </w:num>
+  <w:num w:numId="28" w16cid:durableId="1791243337">
+    <w:abstractNumId w:val="35"/>
+  </w:num>
+  <w:num w:numId="29" w16cid:durableId="520976885">
     <w:abstractNumId w:val="30"/>
   </w:num>
-  <w:num w:numId="28" w16cid:durableId="1791243337">
-    <w:abstractNumId w:val="33"/>
-  </w:num>
-  <w:num w:numId="29" w16cid:durableId="520976885">
-    <w:abstractNumId w:val="28"/>
-  </w:num>
   <w:num w:numId="30" w16cid:durableId="1483083349">
-    <w:abstractNumId w:val="29"/>
+    <w:abstractNumId w:val="31"/>
   </w:num>
   <w:num w:numId="31" w16cid:durableId="569119184">
-    <w:abstractNumId w:val="36"/>
+    <w:abstractNumId w:val="38"/>
   </w:num>
   <w:num w:numId="32" w16cid:durableId="2128085976">
     <w:abstractNumId w:val="8"/>
@@ -9490,13 +9720,13 @@
     <w:abstractNumId w:val="4"/>
   </w:num>
   <w:num w:numId="42" w16cid:durableId="166018076">
-    <w:abstractNumId w:val="27"/>
+    <w:abstractNumId w:val="29"/>
   </w:num>
   <w:num w:numId="43" w16cid:durableId="889224501">
     <w:abstractNumId w:val="24"/>
   </w:num>
   <w:num w:numId="44" w16cid:durableId="1775634182">
-    <w:abstractNumId w:val="38"/>
+    <w:abstractNumId w:val="40"/>
   </w:num>
   <w:num w:numId="45" w16cid:durableId="1687752075">
     <w:abstractNumId w:val="14"/>
@@ -9505,7 +9735,13 @@
     <w:abstractNumId w:val="22"/>
   </w:num>
   <w:num w:numId="47" w16cid:durableId="103307493">
-    <w:abstractNumId w:val="32"/>
+    <w:abstractNumId w:val="34"/>
+  </w:num>
+  <w:num w:numId="48" w16cid:durableId="1410075262">
+    <w:abstractNumId w:val="27"/>
+  </w:num>
+  <w:num w:numId="49" w16cid:durableId="1762140056">
+    <w:abstractNumId w:val="25"/>
   </w:num>
   <w:numIdMacAtCleanup w:val="4"/>
 </w:numbering>
@@ -10012,7 +10248,6 @@
   <w:style w:type="character" w:default="1" w:styleId="Policepardfaut">
     <w:name w:val="Default Paragraph Font"/>
     <w:uiPriority w:val="1"/>
-    <w:semiHidden/>
     <w:unhideWhenUsed/>
   </w:style>
   <w:style w:type="table" w:default="1" w:styleId="TableauNormal">
@@ -10823,25 +11058,6 @@
 </file>
 
 <file path=customXml/item1.xml><?xml version="1.0" encoding="utf-8"?>
-<p:properties xmlns:p="http://schemas.microsoft.com/office/2006/metadata/properties" xmlns:xsi="http://www.w3.org/2001/XMLSchema-instance" xmlns:pc="http://schemas.microsoft.com/office/infopath/2007/PartnerControls">
-  <documentManagement/>
-</p:properties>
-</file>
-
-<file path=customXml/item2.xml><?xml version="1.0" encoding="utf-8"?>
-<b:Sources xmlns:b="http://schemas.openxmlformats.org/officeDocument/2006/bibliography" xmlns="http://schemas.openxmlformats.org/officeDocument/2006/bibliography" SelectedStyle="\APA.XSL" StyleName="APA"/>
-</file>
-
-<file path=customXml/item3.xml><?xml version="1.0" encoding="utf-8"?>
-<?mso-contentType ?>
-<FormTemplates xmlns="http://schemas.microsoft.com/sharepoint/v3/contenttype/forms">
-  <Display>DocumentLibraryForm</Display>
-  <Edit>DocumentLibraryForm</Edit>
-  <New>DocumentLibraryForm</New>
-</FormTemplates>
-</file>
-
-<file path=customXml/item4.xml><?xml version="1.0" encoding="utf-8"?>
 <ct:contentTypeSchema xmlns:ct="http://schemas.microsoft.com/office/2006/metadata/contentType" xmlns:ma="http://schemas.microsoft.com/office/2006/metadata/properties/metaAttributes" ct:_="" ma:_="" ma:contentTypeName="Document" ma:contentTypeID="0x010100FBB99F57F4D89D439F52EDCD0CED316B" ma:contentTypeVersion="7" ma:contentTypeDescription="Crée un document." ma:contentTypeScope="" ma:versionID="7f146099027e1b74c82fbe61e090590b">
   <xsd:schema xmlns:xsd="http://www.w3.org/2001/XMLSchema" xmlns:xs="http://www.w3.org/2001/XMLSchema" xmlns:p="http://schemas.microsoft.com/office/2006/metadata/properties" xmlns:ns2="6b19550a-bdc3-4796-8096-c6911560d534" targetNamespace="http://schemas.microsoft.com/office/2006/metadata/properties" ma:root="true" ma:fieldsID="7044bf5f632aa66a3f32a70d04b92caa" ns2:_="">
     <xsd:import namespace="6b19550a-bdc3-4796-8096-c6911560d534"/>
@@ -11003,32 +11219,26 @@
 </ct:contentTypeSchema>
 </file>
 
-<file path=customXml/itemProps1.xml><?xml version="1.0" encoding="utf-8"?>
-<ds:datastoreItem xmlns:ds="http://schemas.openxmlformats.org/officeDocument/2006/customXml" ds:itemID="{2319CDB8-A2CD-412D-8359-13E6B4DF1FF4}">
-  <ds:schemaRefs>
-    <ds:schemaRef ds:uri="http://schemas.microsoft.com/office/2006/metadata/properties"/>
-    <ds:schemaRef ds:uri="http://schemas.microsoft.com/office/infopath/2007/PartnerControls"/>
-  </ds:schemaRefs>
-</ds:datastoreItem>
+<file path=customXml/item2.xml><?xml version="1.0" encoding="utf-8"?>
+<?mso-contentType ?>
+<FormTemplates xmlns="http://schemas.microsoft.com/sharepoint/v3/contenttype/forms">
+  <Display>DocumentLibraryForm</Display>
+  <Edit>DocumentLibraryForm</Edit>
+  <New>DocumentLibraryForm</New>
+</FormTemplates>
 </file>
 
-<file path=customXml/itemProps2.xml><?xml version="1.0" encoding="utf-8"?>
-<ds:datastoreItem xmlns:ds="http://schemas.openxmlformats.org/officeDocument/2006/customXml" ds:itemID="{C8C35155-3E6A-4058-B6E4-303717845E3B}">
-  <ds:schemaRefs>
-    <ds:schemaRef ds:uri="http://schemas.openxmlformats.org/officeDocument/2006/bibliography"/>
-  </ds:schemaRefs>
-</ds:datastoreItem>
+<file path=customXml/item3.xml><?xml version="1.0" encoding="utf-8"?>
+<b:Sources xmlns:b="http://schemas.openxmlformats.org/officeDocument/2006/bibliography" xmlns="http://schemas.openxmlformats.org/officeDocument/2006/bibliography" SelectedStyle="\APA.XSL" StyleName="APA"/>
 </file>
 
-<file path=customXml/itemProps3.xml><?xml version="1.0" encoding="utf-8"?>
-<ds:datastoreItem xmlns:ds="http://schemas.openxmlformats.org/officeDocument/2006/customXml" ds:itemID="{6C3F7A66-EDE3-46FD-83EB-3C265E5D2669}">
-  <ds:schemaRefs>
-    <ds:schemaRef ds:uri="http://schemas.microsoft.com/sharepoint/v3/contenttype/forms"/>
-  </ds:schemaRefs>
-</ds:datastoreItem>
+<file path=customXml/item4.xml><?xml version="1.0" encoding="utf-8"?>
+<p:properties xmlns:p="http://schemas.microsoft.com/office/2006/metadata/properties" xmlns:xsi="http://www.w3.org/2001/XMLSchema-instance" xmlns:pc="http://schemas.microsoft.com/office/infopath/2007/PartnerControls">
+  <documentManagement/>
+</p:properties>
 </file>
 
-<file path=customXml/itemProps4.xml><?xml version="1.0" encoding="utf-8"?>
+<file path=customXml/itemProps1.xml><?xml version="1.0" encoding="utf-8"?>
 <ds:datastoreItem xmlns:ds="http://schemas.openxmlformats.org/officeDocument/2006/customXml" ds:itemID="{75ED066B-A5C4-4F00-9682-79C6BF6A6E3B}">
   <ds:schemaRefs>
     <ds:schemaRef ds:uri="http://schemas.microsoft.com/office/2006/metadata/contentType"/>
@@ -11044,4 +11254,29 @@
     <ds:schemaRef ds:uri="http://schemas.microsoft.com/internal/obd"/>
   </ds:schemaRefs>
 </ds:datastoreItem>
+</file>
+
+<file path=customXml/itemProps2.xml><?xml version="1.0" encoding="utf-8"?>
+<ds:datastoreItem xmlns:ds="http://schemas.openxmlformats.org/officeDocument/2006/customXml" ds:itemID="{6C3F7A66-EDE3-46FD-83EB-3C265E5D2669}">
+  <ds:schemaRefs>
+    <ds:schemaRef ds:uri="http://schemas.microsoft.com/sharepoint/v3/contenttype/forms"/>
+  </ds:schemaRefs>
+</ds:datastoreItem>
+</file>
+
+<file path=customXml/itemProps3.xml><?xml version="1.0" encoding="utf-8"?>
+<ds:datastoreItem xmlns:ds="http://schemas.openxmlformats.org/officeDocument/2006/customXml" ds:itemID="{C8C35155-3E6A-4058-B6E4-303717845E3B}">
+  <ds:schemaRefs>
+    <ds:schemaRef ds:uri="http://schemas.openxmlformats.org/officeDocument/2006/bibliography"/>
+  </ds:schemaRefs>
+</ds:datastoreItem>
+</file>
+
+<file path=customXml/itemProps4.xml><?xml version="1.0" encoding="utf-8"?>
+<ds:datastoreItem xmlns:ds="http://schemas.openxmlformats.org/officeDocument/2006/customXml" ds:itemID="{2319CDB8-A2CD-412D-8359-13E6B4DF1FF4}">
+  <ds:schemaRefs>
+    <ds:schemaRef ds:uri="http://schemas.microsoft.com/office/2006/metadata/properties"/>
+    <ds:schemaRef ds:uri="http://schemas.microsoft.com/office/infopath/2007/PartnerControls"/>
+  </ds:schemaRefs>
+</ds:datastoreItem>
 </file>
</xml_diff>

<commit_message>
doc(Rapport):Il reste 3.4 à faire
</commit_message>
<xml_diff>
--- a/R-POO-pr55xpt.docx
+++ b/R-POO-pr55xpt.docx
@@ -78,26 +78,14 @@
       <w:pPr>
         <w:spacing w:before="2000"/>
         <w:jc w:val="center"/>
-        <w:rPr>
-          <w:lang w:val="en-US"/>
-        </w:rPr>
-      </w:pPr>
-      <w:r>
-        <w:rPr>
-          <w:lang w:val="en-US"/>
-        </w:rPr>
+      </w:pPr>
+      <w:r>
         <w:t>Maksym Tsybulevskyi</w:t>
       </w:r>
       <w:r>
-        <w:rPr>
-          <w:lang w:val="en-US"/>
-        </w:rPr>
         <w:t xml:space="preserve"> – </w:t>
       </w:r>
       <w:r>
-        <w:rPr>
-          <w:lang w:val="en-US"/>
-        </w:rPr>
         <w:t>CID2A</w:t>
       </w:r>
     </w:p>
@@ -4002,54 +3990,73 @@
     </w:p>
     <w:p>
       <w:pPr>
-        <w:pStyle w:val="Informations"/>
-        <w:numPr>
-          <w:ilvl w:val="5"/>
-          <w:numId w:val="26"/>
-        </w:numPr>
-      </w:pPr>
-      <w:r>
-        <w:t>Ce paragraphe présente le p</w:t>
-      </w:r>
-      <w:r>
-        <w:t>lanning d'origine (</w:t>
-      </w:r>
-      <w:r>
-        <w:t xml:space="preserve">date de début, date de fin, vacances et congés, </w:t>
-      </w:r>
-      <w:r>
-        <w:t xml:space="preserve">liste hiérarchique des tâches ou </w:t>
-      </w:r>
-      <w:r>
-        <w:t>GANTT</w:t>
-      </w:r>
-      <w:r>
-        <w:t>, jalons, durée totale</w:t>
-      </w:r>
-      <w:r>
-        <w:t>)</w:t>
-      </w:r>
-    </w:p>
-    <w:p>
-      <w:pPr>
-        <w:pStyle w:val="Informations"/>
-        <w:numPr>
-          <w:ilvl w:val="5"/>
-          <w:numId w:val="26"/>
-        </w:numPr>
-      </w:pPr>
-      <w:r>
-        <w:t xml:space="preserve">Toutes les mises à jour subies par le planning </w:t>
-      </w:r>
-      <w:r>
-        <w:t xml:space="preserve">sont à reporter </w:t>
-      </w:r>
-      <w:r>
-        <w:t>(avec date de mise à jour)</w:t>
-      </w:r>
-      <w:r>
-        <w:t xml:space="preserve"> et peuvent déboucher sur plusieurs versions de plannings.</w:t>
-      </w:r>
+        <w:ind w:left="426"/>
+        <w:jc w:val="both"/>
+        <w:rPr>
+          <w:rFonts w:ascii="Century Gothic" w:hAnsi="Century Gothic"/>
+        </w:rPr>
+      </w:pPr>
+      <w:r>
+        <w:rPr>
+          <w:lang w:val="ru-RU"/>
+        </w:rPr>
+        <w:drawing>
+          <wp:inline distT="0" distB="0" distL="0" distR="0" wp14:anchorId="23403D28" wp14:editId="06303817">
+            <wp:extent cx="5759450" cy="1758950"/>
+            <wp:effectExtent l="0" t="0" r="0" b="0"/>
+            <wp:docPr id="768490466" name="Image 1"/>
+            <wp:cNvGraphicFramePr>
+              <a:graphicFrameLocks xmlns:a="http://schemas.openxmlformats.org/drawingml/2006/main" noChangeAspect="1"/>
+            </wp:cNvGraphicFramePr>
+            <a:graphic xmlns:a="http://schemas.openxmlformats.org/drawingml/2006/main">
+              <a:graphicData uri="http://schemas.openxmlformats.org/drawingml/2006/picture">
+                <pic:pic xmlns:pic="http://schemas.openxmlformats.org/drawingml/2006/picture">
+                  <pic:nvPicPr>
+                    <pic:cNvPr id="768490466" name=""/>
+                    <pic:cNvPicPr/>
+                  </pic:nvPicPr>
+                  <pic:blipFill>
+                    <a:blip r:embed="rId12" cstate="print">
+                      <a:extLst>
+                        <a:ext uri="{28A0092B-C50C-407E-A947-70E740481C1C}">
+                          <a14:useLocalDpi xmlns:a14="http://schemas.microsoft.com/office/drawing/2010/main" val="0"/>
+                        </a:ext>
+                      </a:extLst>
+                    </a:blip>
+                    <a:stretch>
+                      <a:fillRect/>
+                    </a:stretch>
+                  </pic:blipFill>
+                  <pic:spPr>
+                    <a:xfrm>
+                      <a:off x="0" y="0"/>
+                      <a:ext cx="5759450" cy="1758950"/>
+                    </a:xfrm>
+                    <a:prstGeom prst="rect">
+                      <a:avLst/>
+                    </a:prstGeom>
+                  </pic:spPr>
+                </pic:pic>
+              </a:graphicData>
+            </a:graphic>
+          </wp:inline>
+        </w:drawing>
+      </w:r>
+      <w:r>
+        <w:rPr>
+          <w:rFonts w:ascii="Century Gothic" w:hAnsi="Century Gothic"/>
+        </w:rPr>
+        <w:t> </w:t>
+      </w:r>
+    </w:p>
+    <w:p>
+      <w:pPr>
+        <w:pStyle w:val="Corpsdetexte"/>
+        <w:ind w:left="0"/>
+        <w:rPr>
+          <w:lang w:val="ru-RU"/>
+        </w:rPr>
+      </w:pPr>
     </w:p>
     <w:p>
       <w:pPr>
@@ -4068,6 +4075,9 @@
     <w:p>
       <w:pPr>
         <w:pStyle w:val="Titre2"/>
+        <w:rPr>
+          <w:lang w:val="ru-RU"/>
+        </w:rPr>
       </w:pPr>
       <w:bookmarkStart w:id="23" w:name="_Toc308526333"/>
       <w:r>
@@ -4077,119 +4087,18 @@
     </w:p>
     <w:p>
       <w:pPr>
-        <w:pStyle w:val="Informations"/>
-        <w:numPr>
-          <w:ilvl w:val="5"/>
-          <w:numId w:val="16"/>
-        </w:numPr>
-      </w:pPr>
-      <w:r>
-        <w:t>Ce paragraphe énumère la l</w:t>
-      </w:r>
-      <w:r>
-        <w:t xml:space="preserve">iste des difficultés potentielles de tout </w:t>
-      </w:r>
-      <w:r>
-        <w:t>ordre :</w:t>
-      </w:r>
-    </w:p>
-    <w:p>
-      <w:pPr>
-        <w:pStyle w:val="Informations"/>
-        <w:numPr>
-          <w:ilvl w:val="6"/>
-          <w:numId w:val="16"/>
-        </w:numPr>
-      </w:pPr>
-      <w:r>
-        <w:t xml:space="preserve">Liste des </w:t>
-      </w:r>
-      <w:r>
-        <w:t>compétences</w:t>
-      </w:r>
-      <w:r>
-        <w:t xml:space="preserve"> à acquérir</w:t>
-      </w:r>
-      <w:r>
-        <w:t xml:space="preserve"> ou approfondir</w:t>
-      </w:r>
-    </w:p>
-    <w:p>
-      <w:pPr>
-        <w:pStyle w:val="Informations"/>
-        <w:numPr>
-          <w:ilvl w:val="6"/>
-          <w:numId w:val="16"/>
-        </w:numPr>
-      </w:pPr>
-      <w:r>
-        <w:t xml:space="preserve">Liste du </w:t>
-      </w:r>
-      <w:r>
-        <w:t>matériel</w:t>
-      </w:r>
-      <w:r>
-        <w:t xml:space="preserve"> à exploiter</w:t>
-      </w:r>
-    </w:p>
-    <w:p>
-      <w:pPr>
-        <w:pStyle w:val="Informations"/>
-        <w:numPr>
-          <w:ilvl w:val="6"/>
-          <w:numId w:val="16"/>
-        </w:numPr>
-      </w:pPr>
-      <w:r>
-        <w:t>Recherche d’</w:t>
-      </w:r>
-      <w:r>
-        <w:t>information</w:t>
-      </w:r>
-      <w:r>
-        <w:t>s</w:t>
-      </w:r>
-      <w:r>
-        <w:t xml:space="preserve"> particulières</w:t>
-      </w:r>
-    </w:p>
-    <w:p>
-      <w:pPr>
-        <w:pStyle w:val="Informations"/>
-        <w:numPr>
-          <w:ilvl w:val="6"/>
-          <w:numId w:val="16"/>
-        </w:numPr>
-      </w:pPr>
-      <w:r>
-        <w:t>Gestion du travail en équipe &amp; collaboration</w:t>
-      </w:r>
-    </w:p>
-    <w:p>
-      <w:pPr>
-        <w:pStyle w:val="Informations"/>
-        <w:numPr>
-          <w:ilvl w:val="5"/>
-          <w:numId w:val="16"/>
-        </w:numPr>
-      </w:pPr>
-      <w:r>
-        <w:t>Ainsi que les s</w:t>
-      </w:r>
-      <w:r>
-        <w:t>olutions possibles</w:t>
-      </w:r>
-    </w:p>
-    <w:p>
-      <w:pPr>
-        <w:pStyle w:val="Informations"/>
-        <w:numPr>
-          <w:ilvl w:val="5"/>
-          <w:numId w:val="43"/>
-        </w:numPr>
-      </w:pPr>
-      <w:r>
-        <w:t>Si les spécifications de départ ne laissent pas de doutes sur la manière de réaliser un projet, ce chapitre ne fera que renvoyer le lecteur aux spécifications.</w:t>
+        <w:pStyle w:val="Retraitcorpsdetexte"/>
+        <w:rPr>
+          <w:lang w:val="ru-RU"/>
+        </w:rPr>
+      </w:pPr>
+    </w:p>
+    <w:p>
+      <w:pPr>
+        <w:pStyle w:val="Retraitcorpsdetexte"/>
+      </w:pPr>
+      <w:r>
+        <w:t>Il me faut approfondir mes compétences dans le POO et apprendre les nouvelles méthodes.</w:t>
       </w:r>
     </w:p>
     <w:p>
@@ -4211,158 +4120,242 @@
     </w:p>
     <w:p>
       <w:pPr>
-        <w:pStyle w:val="Informations"/>
-        <w:numPr>
-          <w:ilvl w:val="5"/>
-          <w:numId w:val="17"/>
-        </w:numPr>
-      </w:pPr>
-      <w:r>
-        <w:t xml:space="preserve">Ce paragraphe </w:t>
-      </w:r>
-      <w:r>
-        <w:t>décrit le fonctionnement de manière détaillée.</w:t>
-      </w:r>
-    </w:p>
-    <w:p>
-      <w:pPr>
-        <w:pStyle w:val="Informations"/>
-        <w:numPr>
-          <w:ilvl w:val="6"/>
-          <w:numId w:val="17"/>
-        </w:numPr>
-      </w:pPr>
-      <w:r>
-        <w:t>Autant que possible de manière graphique</w:t>
-      </w:r>
-      <w:r>
-        <w:t>, imagée, tableaux, etc.</w:t>
-      </w:r>
-    </w:p>
-    <w:p>
-      <w:pPr>
-        <w:pStyle w:val="Informations"/>
-        <w:numPr>
-          <w:ilvl w:val="6"/>
-          <w:numId w:val="17"/>
-        </w:numPr>
-      </w:pPr>
-      <w:r>
-        <w:t>Tous les cas particuliers devraient y être spécifiés</w:t>
-      </w:r>
-      <w:r>
-        <w:t>…</w:t>
-      </w:r>
-    </w:p>
-    <w:p>
-      <w:pPr>
-        <w:pStyle w:val="Informations"/>
-        <w:numPr>
-          <w:ilvl w:val="5"/>
-          <w:numId w:val="17"/>
-        </w:numPr>
-      </w:pPr>
-      <w:r>
-        <w:t>Il s’agit d’y présenter le</w:t>
-      </w:r>
-      <w:r>
-        <w:t>s fonctionnalités à développer :</w:t>
-      </w:r>
-    </w:p>
-    <w:p>
-      <w:pPr>
-        <w:pStyle w:val="Informations"/>
-        <w:numPr>
-          <w:ilvl w:val="6"/>
-          <w:numId w:val="17"/>
-        </w:numPr>
-      </w:pPr>
-      <w:r>
-        <w:t>Découpage en étapes, en modules, en fonctionnalités, etc.</w:t>
-      </w:r>
-    </w:p>
-    <w:p>
-      <w:pPr>
-        <w:pStyle w:val="Informations"/>
-        <w:numPr>
-          <w:ilvl w:val="6"/>
-          <w:numId w:val="17"/>
-        </w:numPr>
-      </w:pPr>
-      <w:r>
-        <w:t>Formulaires, interfaces graphiques, pages web, etc.</w:t>
-      </w:r>
-    </w:p>
-    <w:p>
-      <w:pPr>
-        <w:pStyle w:val="Informations"/>
-        <w:numPr>
-          <w:ilvl w:val="6"/>
-          <w:numId w:val="17"/>
-        </w:numPr>
-      </w:pPr>
-      <w:r>
-        <w:t xml:space="preserve">Schémas de navigation, schémas événementiels, </w:t>
+        <w:pStyle w:val="Retraitcorpsdetexte"/>
+      </w:pPr>
+      <w:r>
+        <w:t xml:space="preserve">Fonctionnalités requises (du point de vue client) En quelques mots, l’objectif est de réaliser une simulation d’un parking. Voici une version simplifiée de ce qui est demandé : </w:t>
+      </w:r>
+    </w:p>
+    <w:p>
+      <w:pPr>
+        <w:pStyle w:val="Retraitcorpsdetexte"/>
+      </w:pPr>
+      <w:r>
+        <w:lastRenderedPageBreak/>
+        <w:t>Entrée d’un véhicule Lors de l’entrée d’un véhicule dans le parking, celui-ci doit fournir sa plaque d’immatriculation. Vérifier que le numéro de plaque est cohérent : 2 lettres – jusqu’à 6 chiffres. Attribuer un ticket qui affiche : une heure d’entrée, la place véhicule, le tarif horaire</w:t>
+      </w:r>
+      <w:r>
+        <w:t>.</w:t>
+      </w:r>
+      <w:r>
+        <w:t xml:space="preserve"> </w:t>
+      </w:r>
+    </w:p>
+    <w:p>
+      <w:pPr>
+        <w:pStyle w:val="Retraitcorpsdetexte"/>
+      </w:pPr>
+    </w:p>
+    <w:p>
+      <w:pPr>
+        <w:pStyle w:val="Retraitcorpsdetexte"/>
+      </w:pPr>
+      <w:r>
+        <w:t>Sortie d’un véhicule Lors de la sortie d’un véhicule l’utilisateur doit saisir sa plaque d’immatriculation ou son numéro de place. Le système indique l’heure d’entrée, l’heure de sortie la durée (trouver un moyen de simuler ce point) et le montant à payer (calculé en fonction de la durée) Demander à l’utilisateur s’il veut réellement sortir et si oui rendre la place libre.</w:t>
+      </w:r>
+    </w:p>
+    <w:p>
+      <w:pPr>
+        <w:pStyle w:val="Retraitcorpsdetexte"/>
+      </w:pPr>
+    </w:p>
+    <w:p>
+      <w:pPr>
+        <w:pStyle w:val="Retraitcorpsdetexte"/>
+      </w:pPr>
+      <w:r>
+        <w:t xml:space="preserve">Afficher l’état du parking Afficher un plan du parking avec un moyen d’indiquer quelles sont les places occupées et quelles sont les places libres. </w:t>
+      </w:r>
+    </w:p>
+    <w:p>
+      <w:pPr>
+        <w:pStyle w:val="Retraitcorpsdetexte"/>
+      </w:pPr>
+    </w:p>
+    <w:p>
+      <w:pPr>
+        <w:pStyle w:val="Retraitcorpsdetexte"/>
+      </w:pPr>
+      <w:r>
+        <w:t xml:space="preserve">Rechercher un véhicule Demander à l’utilisateur une plaque d’immatriculation ou un numéro de place pour rechercher le véhicule. Si trouvé : afficher le ticket (immatriculation, heure d’entrée, durée, prix actuel, n° place) </w:t>
+      </w:r>
+    </w:p>
+    <w:p>
+      <w:pPr>
+        <w:pStyle w:val="Retraitcorpsdetexte"/>
+      </w:pPr>
+    </w:p>
+    <w:p>
+      <w:pPr>
+        <w:pStyle w:val="Retraitcorpsdetexte"/>
+      </w:pPr>
+      <w:r>
+        <w:t xml:space="preserve">Statistiques du jour Afficher des statistiques liées à l’utilisation actuelle du parking : nombre de place occupées, % du total, montant total payé, durée de stationnement actuel de tous les véhicules, etc. </w:t>
+      </w:r>
+    </w:p>
+    <w:p>
+      <w:pPr>
+        <w:pStyle w:val="Retraitcorpsdetexte"/>
+      </w:pPr>
+    </w:p>
+    <w:p>
+      <w:pPr>
+        <w:pStyle w:val="Retraitcorpsdetexte"/>
+      </w:pPr>
+      <w:r>
+        <w:t xml:space="preserve">Historiques des transactions Afficher </w:t>
+      </w:r>
+      <w:proofErr w:type="gramStart"/>
+      <w:r>
+        <w:t>les transaction effectuées</w:t>
+      </w:r>
+      <w:proofErr w:type="gramEnd"/>
+      <w:r>
+        <w:t xml:space="preserve"> : </w:t>
+      </w:r>
+      <w:r>
+        <w:sym w:font="Symbol" w:char="F0B7"/>
+      </w:r>
+      <w:r>
+        <w:t xml:space="preserve"> ENTREE (heure d’entrée) – Plaque d’immatriculation (n° place) </w:t>
+      </w:r>
+      <w:r>
+        <w:sym w:font="Symbol" w:char="F0B7"/>
+      </w:r>
+      <w:r>
+        <w:t xml:space="preserve"> SORTIE (heure de sortie) – Plaque d’immatriculation (n° place, montant payé) </w:t>
+      </w:r>
+    </w:p>
+    <w:p>
+      <w:pPr>
+        <w:pStyle w:val="Retraitcorpsdetexte"/>
+      </w:pPr>
+    </w:p>
+    <w:p>
+      <w:pPr>
+        <w:pStyle w:val="Retraitcorpsdetexte"/>
+      </w:pPr>
+      <w:r>
+        <w:t xml:space="preserve">Autres Pour aller au-delà du minimum : a. Avoir plusieurs types de véhicules dans le parking (avec des tarifs différents) b. Version Windows Forms c. Autre proposition personnelle, validée par le </w:t>
       </w:r>
       <w:proofErr w:type="spellStart"/>
       <w:r>
-        <w:t>structogramme</w:t>
+        <w:t>CdP</w:t>
       </w:r>
       <w:proofErr w:type="spellEnd"/>
       <w:r>
-        <w:t xml:space="preserve">, </w:t>
-      </w:r>
-      <w:r>
-        <w:t>pseudocode</w:t>
-      </w:r>
-      <w:r>
-        <w:t>, etc.</w:t>
-      </w:r>
-    </w:p>
-    <w:p>
-      <w:pPr>
-        <w:pStyle w:val="Informations"/>
-        <w:numPr>
-          <w:ilvl w:val="5"/>
-          <w:numId w:val="17"/>
-        </w:numPr>
-      </w:pPr>
-      <w:r>
-        <w:t>Si le pr</w:t>
-      </w:r>
-      <w:r>
-        <w:t xml:space="preserve">ojet inclut une base </w:t>
-      </w:r>
-      <w:r>
-        <w:t>de données :</w:t>
-      </w:r>
-    </w:p>
-    <w:p>
-      <w:pPr>
-        <w:pStyle w:val="Informations"/>
-        <w:numPr>
-          <w:ilvl w:val="6"/>
-          <w:numId w:val="17"/>
-        </w:numPr>
-      </w:pPr>
-      <w:r>
-        <w:t>Dictionnaire</w:t>
-      </w:r>
-      <w:r>
-        <w:t xml:space="preserve"> des données</w:t>
-      </w:r>
-    </w:p>
-    <w:p>
-      <w:pPr>
-        <w:pStyle w:val="Informations"/>
-        <w:numPr>
-          <w:ilvl w:val="6"/>
-          <w:numId w:val="17"/>
-        </w:numPr>
-      </w:pPr>
-      <w:r>
-        <w:t>Modèle conceptuel des données, modèles logique des données.</w:t>
-      </w:r>
+        <w:t xml:space="preserve"> </w:t>
+      </w:r>
+    </w:p>
+    <w:p>
+      <w:pPr>
+        <w:pStyle w:val="Retraitcorpsdetexte"/>
+      </w:pPr>
+    </w:p>
+    <w:p>
+      <w:pPr>
+        <w:pStyle w:val="Retraitcorpsdetexte"/>
+        <w:rPr>
+          <w:sz w:val="24"/>
+          <w:szCs w:val="24"/>
+        </w:rPr>
+      </w:pPr>
+      <w:r>
+        <w:rPr>
+          <w:sz w:val="24"/>
+          <w:szCs w:val="24"/>
+        </w:rPr>
+        <w:t xml:space="preserve">Contraintes techniques </w:t>
+      </w:r>
+    </w:p>
+    <w:p>
+      <w:pPr>
+        <w:pStyle w:val="Retraitcorpsdetexte"/>
+        <w:rPr>
+          <w:sz w:val="24"/>
+          <w:szCs w:val="24"/>
+        </w:rPr>
+      </w:pPr>
+    </w:p>
+    <w:p>
+      <w:pPr>
+        <w:pStyle w:val="Retraitcorpsdetexte"/>
+      </w:pPr>
+      <w:r>
+        <w:t xml:space="preserve">1. Le nommage des éléments de code doit être cohérent avec le thème du parking. </w:t>
+      </w:r>
+    </w:p>
+    <w:p>
+      <w:pPr>
+        <w:pStyle w:val="Retraitcorpsdetexte"/>
+      </w:pPr>
+    </w:p>
+    <w:p>
+      <w:pPr>
+        <w:pStyle w:val="Retraitcorpsdetexte"/>
+      </w:pPr>
+      <w:r>
+        <w:t xml:space="preserve">2. Le code contient (au moins) une classe pour modéliser chacun des éléments suivants : </w:t>
+      </w:r>
+    </w:p>
+    <w:p>
+      <w:pPr>
+        <w:pStyle w:val="Retraitcorpsdetexte"/>
+      </w:pPr>
+      <w:r>
+        <w:sym w:font="Symbol" w:char="F0B7"/>
+      </w:r>
+      <w:r>
+        <w:t xml:space="preserve"> Le parking</w:t>
+      </w:r>
+    </w:p>
+    <w:p>
+      <w:pPr>
+        <w:pStyle w:val="Retraitcorpsdetexte"/>
+      </w:pPr>
+      <w:r>
+        <w:sym w:font="Symbol" w:char="F0B7"/>
+      </w:r>
+      <w:r>
+        <w:t xml:space="preserve"> La place de parking </w:t>
+      </w:r>
+    </w:p>
+    <w:p>
+      <w:pPr>
+        <w:pStyle w:val="Retraitcorpsdetexte"/>
+      </w:pPr>
+      <w:r>
+        <w:sym w:font="Symbol" w:char="F0B7"/>
+      </w:r>
+      <w:r>
+        <w:t xml:space="preserve"> Un véhicule </w:t>
+      </w:r>
+    </w:p>
+    <w:p>
+      <w:pPr>
+        <w:pStyle w:val="Retraitcorpsdetexte"/>
+      </w:pPr>
+      <w:r>
+        <w:sym w:font="Symbol" w:char="F0B7"/>
+      </w:r>
+      <w:r>
+        <w:t xml:space="preserve"> Le ticket</w:t>
+      </w:r>
+    </w:p>
+    <w:p>
+      <w:pPr>
+        <w:pStyle w:val="Retraitcorpsdetexte"/>
+      </w:pPr>
+    </w:p>
+    <w:p>
+      <w:pPr>
+        <w:pStyle w:val="Retraitcorpsdetexte"/>
+      </w:pPr>
+    </w:p>
+    <w:p>
+      <w:pPr>
+        <w:pStyle w:val="Retraitcorpsdetexte"/>
+      </w:pPr>
     </w:p>
     <w:p>
       <w:pPr>
@@ -4372,7 +4365,6 @@
       <w:bookmarkStart w:id="28" w:name="_Toc165969651"/>
       <w:bookmarkStart w:id="29" w:name="_Toc308526335"/>
       <w:r>
-        <w:lastRenderedPageBreak/>
         <w:t>Conception des tests</w:t>
       </w:r>
       <w:bookmarkEnd w:id="27"/>
@@ -4381,47 +4373,34 @@
     </w:p>
     <w:p>
       <w:pPr>
-        <w:pStyle w:val="Informations"/>
-        <w:numPr>
-          <w:ilvl w:val="5"/>
-          <w:numId w:val="18"/>
-        </w:numPr>
-      </w:pPr>
-      <w:r>
-        <w:t xml:space="preserve">Ce paragraphe permet de spécifier la stratégie de </w:t>
-      </w:r>
-      <w:r>
-        <w:t>test </w:t>
-      </w:r>
-      <w:r>
-        <w:t xml:space="preserve">qui sera menée au point </w:t>
-      </w:r>
-      <w:r>
-        <w:fldChar w:fldCharType="begin"/>
-      </w:r>
-      <w:r>
-        <w:instrText xml:space="preserve"> REF _Ref308525868 \r \h </w:instrText>
-      </w:r>
-      <w:r>
-        <w:fldChar w:fldCharType="separate"/>
-      </w:r>
-      <w:r>
-        <w:t>5.1</w:t>
-      </w:r>
-      <w:r>
-        <w:fldChar w:fldCharType="end"/>
-      </w:r>
-    </w:p>
-    <w:p>
-      <w:pPr>
-        <w:pStyle w:val="Informations"/>
-        <w:numPr>
-          <w:ilvl w:val="5"/>
-          <w:numId w:val="18"/>
-        </w:numPr>
-      </w:pPr>
-      <w:r>
-        <w:t>Qui, quand, avec quelles données, dans quel ordre, etc.</w:t>
+        <w:pStyle w:val="Retraitcorpsdetexte"/>
+      </w:pPr>
+    </w:p>
+    <w:p>
+      <w:pPr>
+        <w:pStyle w:val="Retraitcorpsdetexte"/>
+        <w:jc w:val="left"/>
+      </w:pPr>
+      <w:r>
+        <w:t xml:space="preserve">Le développeur </w:t>
+      </w:r>
+      <w:r>
+        <w:t xml:space="preserve">tout au long </w:t>
+      </w:r>
+      <w:r>
+        <w:t xml:space="preserve">de projet va faire des tests avec </w:t>
+      </w:r>
+      <w:r>
+        <w:rPr>
+          <w:lang w:val="fr-FR"/>
+        </w:rPr>
+        <w:t>les données disponibles à ce moment-là</w:t>
+      </w:r>
+      <w:r>
+        <w:rPr>
+          <w:lang w:val="fr-FR"/>
+        </w:rPr>
+        <w:t>.</w:t>
       </w:r>
     </w:p>
     <w:p>
@@ -4480,6 +4459,7 @@
       <w:bookmarkStart w:id="34" w:name="_Toc308526337"/>
       <w:bookmarkEnd w:id="31"/>
       <w:r>
+        <w:lastRenderedPageBreak/>
         <w:t>Réalisation</w:t>
       </w:r>
       <w:bookmarkEnd w:id="32"/>
@@ -4780,8 +4760,13 @@
           <w:numId w:val="22"/>
         </w:numPr>
       </w:pPr>
-      <w:r>
-        <w:t>raison, décisions, etc.</w:t>
+      <w:proofErr w:type="gramStart"/>
+      <w:r>
+        <w:t>raison</w:t>
+      </w:r>
+      <w:proofErr w:type="gramEnd"/>
+      <w:r>
+        <w:t>, décisions, etc.</w:t>
       </w:r>
     </w:p>
     <w:p>
@@ -4793,8 +4778,13 @@
         </w:numPr>
       </w:pPr>
       <w:r>
-        <w:t>Liste des bugs répertoriés avec la date de découverte et leur état:</w:t>
-      </w:r>
+        <w:t xml:space="preserve">Liste des bugs répertoriés avec la date de découverte et leur </w:t>
+      </w:r>
+      <w:proofErr w:type="gramStart"/>
+      <w:r>
+        <w:t>état:</w:t>
+      </w:r>
+      <w:proofErr w:type="gramEnd"/>
     </w:p>
     <w:p>
       <w:pPr>
@@ -4910,7 +4900,15 @@
         <w:t xml:space="preserve"> projet.</w:t>
       </w:r>
       <w:r>
-        <w:t xml:space="preserve"> Indiquer les différence entre les planifications initiales et détaillées avec le journal de travail.</w:t>
+        <w:t xml:space="preserve"> Indiquer </w:t>
+      </w:r>
+      <w:proofErr w:type="gramStart"/>
+      <w:r>
+        <w:t>les différence</w:t>
+      </w:r>
+      <w:proofErr w:type="gramEnd"/>
+      <w:r>
+        <w:t xml:space="preserve"> entre les planifications initiales et détaillées avec le journal de travail.</w:t>
       </w:r>
     </w:p>
     <w:p>
@@ -4934,11 +4932,16 @@
         </w:numPr>
       </w:pPr>
       <w:r>
-        <w:t>Si c’était à refaire</w:t>
+        <w:t xml:space="preserve">Si c’était à </w:t>
+      </w:r>
+      <w:proofErr w:type="gramStart"/>
+      <w:r>
+        <w:t>refaire</w:t>
       </w:r>
       <w:r>
         <w:t>:</w:t>
       </w:r>
+      <w:proofErr w:type="gramEnd"/>
     </w:p>
     <w:p>
       <w:pPr>
@@ -5005,8 +5008,13 @@
           <w:numId w:val="24"/>
         </w:numPr>
       </w:pPr>
-      <w:r>
-        <w:t>Suite à donner, améliorations souhaitables, …</w:t>
+      <w:proofErr w:type="gramStart"/>
+      <w:r>
+        <w:t>Suite à</w:t>
+      </w:r>
+      <w:proofErr w:type="gramEnd"/>
+      <w:r>
+        <w:t xml:space="preserve"> donner, améliorations souhaitables, …</w:t>
       </w:r>
     </w:p>
     <w:p>
@@ -5029,7 +5037,6 @@
       <w:bookmarkStart w:id="57" w:name="_Toc165969657"/>
       <w:bookmarkStart w:id="58" w:name="_Toc308526346"/>
       <w:r>
-        <w:lastRenderedPageBreak/>
         <w:t>Divers</w:t>
       </w:r>
       <w:bookmarkEnd w:id="56"/>
@@ -5139,6 +5146,7 @@
       </w:pPr>
       <w:bookmarkStart w:id="64" w:name="_Toc308526350"/>
       <w:r>
+        <w:lastRenderedPageBreak/>
         <w:t>Annexes</w:t>
       </w:r>
       <w:bookmarkEnd w:id="64"/>
@@ -5151,8 +5159,13 @@
           <w:numId w:val="25"/>
         </w:numPr>
       </w:pPr>
-      <w:r>
-        <w:t>Listing du code source (partiel ou, plus rarement complet)</w:t>
+      <w:proofErr w:type="gramStart"/>
+      <w:r>
+        <w:t>Listing</w:t>
+      </w:r>
+      <w:proofErr w:type="gramEnd"/>
+      <w:r>
+        <w:t xml:space="preserve"> du code source (partiel ou, plus rarement complet)</w:t>
       </w:r>
     </w:p>
     <w:p>
@@ -5216,8 +5229,8 @@
       </w:r>
     </w:p>
     <w:sectPr>
-      <w:headerReference w:type="default" r:id="rId12"/>
-      <w:footerReference w:type="default" r:id="rId13"/>
+      <w:headerReference w:type="default" r:id="rId13"/>
+      <w:footerReference w:type="default" r:id="rId14"/>
       <w:pgSz w:w="11906" w:h="16838" w:code="9"/>
       <w:pgMar w:top="1418" w:right="1418" w:bottom="1418" w:left="1418" w:header="709" w:footer="709" w:gutter="0"/>
       <w:cols w:space="708"/>
@@ -5633,12 +5646,21 @@
               <w:szCs w:val="16"/>
             </w:rPr>
           </w:pPr>
+          <w:proofErr w:type="gramStart"/>
           <w:r>
             <w:rPr>
               <w:rFonts w:cs="Arial"/>
               <w:szCs w:val="16"/>
             </w:rPr>
-            <w:t xml:space="preserve">Version: </w:t>
+            <w:t>Version:</w:t>
+          </w:r>
+          <w:proofErr w:type="gramEnd"/>
+          <w:r>
+            <w:rPr>
+              <w:rFonts w:cs="Arial"/>
+              <w:szCs w:val="16"/>
+            </w:rPr>
+            <w:t xml:space="preserve"> </w:t>
           </w:r>
           <w:fldSimple w:instr=" REVNUM   \* MERGEFORMAT ">
             <w:r>
@@ -5684,7 +5706,7 @@
               <w:noProof/>
               <w:szCs w:val="16"/>
             </w:rPr>
-            <w:t>28.08.2026 09:00</w:t>
+            <w:t>28.08.2026 09:54</w:t>
           </w:r>
           <w:r>
             <w:rPr>
@@ -10768,6 +10790,24 @@
       <w:rFonts w:asciiTheme="majorHAnsi" w:hAnsiTheme="majorHAnsi"/>
     </w:rPr>
   </w:style>
+  <w:style w:type="paragraph" w:styleId="PrformatHTML">
+    <w:name w:val="HTML Preformatted"/>
+    <w:basedOn w:val="Normal"/>
+    <w:link w:val="PrformatHTMLCar"/>
+    <w:rsid w:val="000E4FDF"/>
+    <w:rPr>
+      <w:rFonts w:ascii="Consolas" w:hAnsi="Consolas"/>
+    </w:rPr>
+  </w:style>
+  <w:style w:type="character" w:customStyle="1" w:styleId="PrformatHTMLCar">
+    <w:name w:val="Préformaté HTML Car"/>
+    <w:basedOn w:val="Policepardfaut"/>
+    <w:link w:val="PrformatHTML"/>
+    <w:rsid w:val="000E4FDF"/>
+    <w:rPr>
+      <w:rFonts w:ascii="Consolas" w:hAnsi="Consolas"/>
+    </w:rPr>
+  </w:style>
 </w:styles>
 </file>
 
@@ -11058,6 +11098,25 @@
 </file>
 
 <file path=customXml/item1.xml><?xml version="1.0" encoding="utf-8"?>
+<p:properties xmlns:p="http://schemas.microsoft.com/office/2006/metadata/properties" xmlns:xsi="http://www.w3.org/2001/XMLSchema-instance" xmlns:pc="http://schemas.microsoft.com/office/infopath/2007/PartnerControls">
+  <documentManagement/>
+</p:properties>
+</file>
+
+<file path=customXml/item2.xml><?xml version="1.0" encoding="utf-8"?>
+<b:Sources xmlns:b="http://schemas.openxmlformats.org/officeDocument/2006/bibliography" xmlns="http://schemas.openxmlformats.org/officeDocument/2006/bibliography" SelectedStyle="\APA.XSL" StyleName="APA"/>
+</file>
+
+<file path=customXml/item3.xml><?xml version="1.0" encoding="utf-8"?>
+<?mso-contentType ?>
+<FormTemplates xmlns="http://schemas.microsoft.com/sharepoint/v3/contenttype/forms">
+  <Display>DocumentLibraryForm</Display>
+  <Edit>DocumentLibraryForm</Edit>
+  <New>DocumentLibraryForm</New>
+</FormTemplates>
+</file>
+
+<file path=customXml/item4.xml><?xml version="1.0" encoding="utf-8"?>
 <ct:contentTypeSchema xmlns:ct="http://schemas.microsoft.com/office/2006/metadata/contentType" xmlns:ma="http://schemas.microsoft.com/office/2006/metadata/properties/metaAttributes" ct:_="" ma:_="" ma:contentTypeName="Document" ma:contentTypeID="0x010100FBB99F57F4D89D439F52EDCD0CED316B" ma:contentTypeVersion="7" ma:contentTypeDescription="Crée un document." ma:contentTypeScope="" ma:versionID="7f146099027e1b74c82fbe61e090590b">
   <xsd:schema xmlns:xsd="http://www.w3.org/2001/XMLSchema" xmlns:xs="http://www.w3.org/2001/XMLSchema" xmlns:p="http://schemas.microsoft.com/office/2006/metadata/properties" xmlns:ns2="6b19550a-bdc3-4796-8096-c6911560d534" targetNamespace="http://schemas.microsoft.com/office/2006/metadata/properties" ma:root="true" ma:fieldsID="7044bf5f632aa66a3f32a70d04b92caa" ns2:_="">
     <xsd:import namespace="6b19550a-bdc3-4796-8096-c6911560d534"/>
@@ -11219,26 +11278,32 @@
 </ct:contentTypeSchema>
 </file>
 
-<file path=customXml/item2.xml><?xml version="1.0" encoding="utf-8"?>
-<?mso-contentType ?>
-<FormTemplates xmlns="http://schemas.microsoft.com/sharepoint/v3/contenttype/forms">
-  <Display>DocumentLibraryForm</Display>
-  <Edit>DocumentLibraryForm</Edit>
-  <New>DocumentLibraryForm</New>
-</FormTemplates>
+<file path=customXml/itemProps1.xml><?xml version="1.0" encoding="utf-8"?>
+<ds:datastoreItem xmlns:ds="http://schemas.openxmlformats.org/officeDocument/2006/customXml" ds:itemID="{2319CDB8-A2CD-412D-8359-13E6B4DF1FF4}">
+  <ds:schemaRefs>
+    <ds:schemaRef ds:uri="http://schemas.microsoft.com/office/2006/metadata/properties"/>
+    <ds:schemaRef ds:uri="http://schemas.microsoft.com/office/infopath/2007/PartnerControls"/>
+  </ds:schemaRefs>
+</ds:datastoreItem>
 </file>
 
-<file path=customXml/item3.xml><?xml version="1.0" encoding="utf-8"?>
-<b:Sources xmlns:b="http://schemas.openxmlformats.org/officeDocument/2006/bibliography" xmlns="http://schemas.openxmlformats.org/officeDocument/2006/bibliography" SelectedStyle="\APA.XSL" StyleName="APA"/>
+<file path=customXml/itemProps2.xml><?xml version="1.0" encoding="utf-8"?>
+<ds:datastoreItem xmlns:ds="http://schemas.openxmlformats.org/officeDocument/2006/customXml" ds:itemID="{C8C35155-3E6A-4058-B6E4-303717845E3B}">
+  <ds:schemaRefs>
+    <ds:schemaRef ds:uri="http://schemas.openxmlformats.org/officeDocument/2006/bibliography"/>
+  </ds:schemaRefs>
+</ds:datastoreItem>
 </file>
 
-<file path=customXml/item4.xml><?xml version="1.0" encoding="utf-8"?>
-<p:properties xmlns:p="http://schemas.microsoft.com/office/2006/metadata/properties" xmlns:xsi="http://www.w3.org/2001/XMLSchema-instance" xmlns:pc="http://schemas.microsoft.com/office/infopath/2007/PartnerControls">
-  <documentManagement/>
-</p:properties>
+<file path=customXml/itemProps3.xml><?xml version="1.0" encoding="utf-8"?>
+<ds:datastoreItem xmlns:ds="http://schemas.openxmlformats.org/officeDocument/2006/customXml" ds:itemID="{6C3F7A66-EDE3-46FD-83EB-3C265E5D2669}">
+  <ds:schemaRefs>
+    <ds:schemaRef ds:uri="http://schemas.microsoft.com/sharepoint/v3/contenttype/forms"/>
+  </ds:schemaRefs>
+</ds:datastoreItem>
 </file>
 
-<file path=customXml/itemProps1.xml><?xml version="1.0" encoding="utf-8"?>
+<file path=customXml/itemProps4.xml><?xml version="1.0" encoding="utf-8"?>
 <ds:datastoreItem xmlns:ds="http://schemas.openxmlformats.org/officeDocument/2006/customXml" ds:itemID="{75ED066B-A5C4-4F00-9682-79C6BF6A6E3B}">
   <ds:schemaRefs>
     <ds:schemaRef ds:uri="http://schemas.microsoft.com/office/2006/metadata/contentType"/>
@@ -11254,29 +11319,4 @@
     <ds:schemaRef ds:uri="http://schemas.microsoft.com/internal/obd"/>
   </ds:schemaRefs>
 </ds:datastoreItem>
-</file>
-
-<file path=customXml/itemProps2.xml><?xml version="1.0" encoding="utf-8"?>
-<ds:datastoreItem xmlns:ds="http://schemas.openxmlformats.org/officeDocument/2006/customXml" ds:itemID="{6C3F7A66-EDE3-46FD-83EB-3C265E5D2669}">
-  <ds:schemaRefs>
-    <ds:schemaRef ds:uri="http://schemas.microsoft.com/sharepoint/v3/contenttype/forms"/>
-  </ds:schemaRefs>
-</ds:datastoreItem>
-</file>
-
-<file path=customXml/itemProps3.xml><?xml version="1.0" encoding="utf-8"?>
-<ds:datastoreItem xmlns:ds="http://schemas.openxmlformats.org/officeDocument/2006/customXml" ds:itemID="{C8C35155-3E6A-4058-B6E4-303717845E3B}">
-  <ds:schemaRefs>
-    <ds:schemaRef ds:uri="http://schemas.openxmlformats.org/officeDocument/2006/bibliography"/>
-  </ds:schemaRefs>
-</ds:datastoreItem>
-</file>
-
-<file path=customXml/itemProps4.xml><?xml version="1.0" encoding="utf-8"?>
-<ds:datastoreItem xmlns:ds="http://schemas.openxmlformats.org/officeDocument/2006/customXml" ds:itemID="{2319CDB8-A2CD-412D-8359-13E6B4DF1FF4}">
-  <ds:schemaRefs>
-    <ds:schemaRef ds:uri="http://schemas.microsoft.com/office/2006/metadata/properties"/>
-    <ds:schemaRef ds:uri="http://schemas.microsoft.com/office/infopath/2007/PartnerControls"/>
-  </ds:schemaRefs>
-</ds:datastoreItem>
 </file>
</xml_diff>